<commit_message>
add claude guide #1
</commit_message>
<xml_diff>
--- a/syllabus.docx
+++ b/syllabus.docx
@@ -1,6 +1,6 @@
 
 <file path=word/document.xml><?xml version="1.0" encoding="utf-8"?>
-<w:document xmlns:wpc="http://schemas.microsoft.com/office/word/2010/wordprocessingCanvas" xmlns:cx="http://schemas.microsoft.com/office/drawing/2014/chartex" xmlns:cx1="http://schemas.microsoft.com/office/drawing/2015/9/8/chartex" xmlns:cx2="http://schemas.microsoft.com/office/drawing/2015/10/21/chartex" xmlns:cx3="http://schemas.microsoft.com/office/drawing/2016/5/9/chartex" xmlns:cx4="http://schemas.microsoft.com/office/drawing/2016/5/10/chartex" xmlns:cx5="http://schemas.microsoft.com/office/drawing/2016/5/11/chartex" xmlns:cx6="http://schemas.microsoft.com/office/drawing/2016/5/12/chartex" xmlns:cx7="http://schemas.microsoft.com/office/drawing/2016/5/13/chartex" xmlns:cx8="http://schemas.microsoft.com/office/drawing/2016/5/14/chartex" xmlns:mc="http://schemas.openxmlformats.org/markup-compatibility/2006" xmlns:aink="http://schemas.microsoft.com/office/drawing/2016/ink" xmlns:am3d="http://schemas.microsoft.com/office/drawing/2017/model3d" xmlns:o="urn:schemas-microsoft-com:office:office" xmlns:oel="http://schemas.microsoft.com/office/2019/extlst" xmlns:r="http://schemas.openxmlformats.org/officeDocument/2006/relationships" xmlns:m="http://schemas.openxmlformats.org/officeDocument/2006/math" xmlns:v="urn:schemas-microsoft-com:vml" xmlns:wp14="http://schemas.microsoft.com/office/word/2010/wordprocessingDrawing" xmlns:wp="http://schemas.openxmlformats.org/drawingml/2006/wordprocessingDrawing" xmlns:w10="urn:schemas-microsoft-com:office:word" xmlns:w="http://schemas.openxmlformats.org/wordprocessingml/2006/main" xmlns:w14="http://schemas.microsoft.com/office/word/2010/wordml" xmlns:w15="http://schemas.microsoft.com/office/word/2012/wordml" xmlns:w16cei="http://schemas.microsoft.com/office/word/2026/wordml/cei" xmlns:w16cex="http://schemas.microsoft.com/office/word/2018/wordml/cex" xmlns:w16cid="http://schemas.microsoft.com/office/word/2016/wordml/cid" xmlns:w16="http://schemas.microsoft.com/office/word/2018/wordml" xmlns:w16du="http://schemas.microsoft.com/office/word/2023/wordml/word16du" xmlns:w16sdtdh="http://schemas.microsoft.com/office/word/2020/wordml/sdtdatahash" xmlns:w16sdtfl="http://schemas.microsoft.com/office/word/2024/wordml/sdtformatlock" xmlns:w16se="http://schemas.microsoft.com/office/word/2015/wordml/symex" xmlns:wpg="http://schemas.microsoft.com/office/word/2010/wordprocessingGroup" xmlns:wpi="http://schemas.microsoft.com/office/word/2010/wordprocessingInk" xmlns:wne="http://schemas.microsoft.com/office/word/2006/wordml" xmlns:wps="http://schemas.microsoft.com/office/word/2010/wordprocessingShape" mc:Ignorable="w14 w15 w16se w16cid w16 w16cex w16sdtdh w16sdtfl w16du wp14">
+<w:document xmlns:wpc="http://schemas.microsoft.com/office/word/2010/wordprocessingCanvas" xmlns:cx="http://schemas.microsoft.com/office/drawing/2014/chartex" xmlns:cx1="http://schemas.microsoft.com/office/drawing/2015/9/8/chartex" xmlns:cx2="http://schemas.microsoft.com/office/drawing/2015/10/21/chartex" xmlns:cx3="http://schemas.microsoft.com/office/drawing/2016/5/9/chartex" xmlns:cx4="http://schemas.microsoft.com/office/drawing/2016/5/10/chartex" xmlns:cx5="http://schemas.microsoft.com/office/drawing/2016/5/11/chartex" xmlns:cx6="http://schemas.microsoft.com/office/drawing/2016/5/12/chartex" xmlns:cx7="http://schemas.microsoft.com/office/drawing/2016/5/13/chartex" xmlns:cx8="http://schemas.microsoft.com/office/drawing/2016/5/14/chartex" xmlns:mc="http://schemas.openxmlformats.org/markup-compatibility/2006" xmlns:aink="http://schemas.microsoft.com/office/drawing/2016/ink" xmlns:am3d="http://schemas.microsoft.com/office/drawing/2017/model3d" xmlns:o="urn:schemas-microsoft-com:office:office" xmlns:oel="http://schemas.microsoft.com/office/2019/extlst" xmlns:r="http://schemas.openxmlformats.org/officeDocument/2006/relationships" xmlns:m="http://schemas.openxmlformats.org/officeDocument/2006/math" xmlns:v="urn:schemas-microsoft-com:vml" xmlns:wp14="http://schemas.microsoft.com/office/word/2010/wordprocessingDrawing" xmlns:wp="http://schemas.openxmlformats.org/drawingml/2006/wordprocessingDrawing" xmlns:w10="urn:schemas-microsoft-com:office:word" xmlns:w="http://schemas.openxmlformats.org/wordprocessingml/2006/main" xmlns:w14="http://schemas.microsoft.com/office/word/2010/wordml" xmlns:w15="http://schemas.microsoft.com/office/word/2012/wordml" xmlns:w16cex="http://schemas.microsoft.com/office/word/2018/wordml/cex" xmlns:w16cid="http://schemas.microsoft.com/office/word/2016/wordml/cid" xmlns:w16="http://schemas.microsoft.com/office/word/2018/wordml" xmlns:w16du="http://schemas.microsoft.com/office/word/2023/wordml/word16du" xmlns:w16sdtdh="http://schemas.microsoft.com/office/word/2020/wordml/sdtdatahash" xmlns:w16sdtfl="http://schemas.microsoft.com/office/word/2024/wordml/sdtformatlock" xmlns:w16se="http://schemas.microsoft.com/office/word/2015/wordml/symex" xmlns:wpg="http://schemas.microsoft.com/office/word/2010/wordprocessingGroup" xmlns:wpi="http://schemas.microsoft.com/office/word/2010/wordprocessingInk" xmlns:wne="http://schemas.microsoft.com/office/word/2006/wordml" xmlns:wps="http://schemas.microsoft.com/office/word/2010/wordprocessingShape" mc:Ignorable="w14 w15 w16se w16cid w16 w16cex w16sdtdh w16sdtfl w16du wp14">
   <w:body>
     <w:p>
       <w:pPr>
@@ -20,7 +20,127 @@
           <w:rtl/>
           <w:lang w:val="he-IL"/>
         </w:rPr>
-        <w:t>"וּרְחֹבוֹת הָעִיר יִמָּלְאוּ יְלָדִים וִילָדוֹת מְשַׂחֲקִים בִּרְחֹבֹתֶיהָ</w:t>
+        <w:t>"</w:t>
+      </w:r>
+      <w:proofErr w:type="spellStart"/>
+      <w:r>
+        <w:rPr>
+          <w:rFonts w:asciiTheme="minorHAnsi" w:hAnsiTheme="minorHAnsi" w:cstheme="minorHAnsi"/>
+          <w:color w:val="0000CC"/>
+          <w:sz w:val="20"/>
+          <w:szCs w:val="20"/>
+          <w:rtl/>
+          <w:lang w:val="he-IL"/>
+        </w:rPr>
+        <w:t>וּרְחֹבוֹת</w:t>
+      </w:r>
+      <w:proofErr w:type="spellEnd"/>
+      <w:r>
+        <w:rPr>
+          <w:rFonts w:asciiTheme="minorHAnsi" w:hAnsiTheme="minorHAnsi" w:cstheme="minorHAnsi"/>
+          <w:color w:val="0000CC"/>
+          <w:sz w:val="20"/>
+          <w:szCs w:val="20"/>
+          <w:rtl/>
+          <w:lang w:val="he-IL"/>
+        </w:rPr>
+        <w:t xml:space="preserve"> הָעִיר </w:t>
+      </w:r>
+      <w:proofErr w:type="spellStart"/>
+      <w:r>
+        <w:rPr>
+          <w:rFonts w:asciiTheme="minorHAnsi" w:hAnsiTheme="minorHAnsi" w:cstheme="minorHAnsi"/>
+          <w:color w:val="0000CC"/>
+          <w:sz w:val="20"/>
+          <w:szCs w:val="20"/>
+          <w:rtl/>
+          <w:lang w:val="he-IL"/>
+        </w:rPr>
+        <w:t>יִמָּלְאוּ</w:t>
+      </w:r>
+      <w:proofErr w:type="spellEnd"/>
+      <w:r>
+        <w:rPr>
+          <w:rFonts w:asciiTheme="minorHAnsi" w:hAnsiTheme="minorHAnsi" w:cstheme="minorHAnsi"/>
+          <w:color w:val="0000CC"/>
+          <w:sz w:val="20"/>
+          <w:szCs w:val="20"/>
+          <w:rtl/>
+          <w:lang w:val="he-IL"/>
+        </w:rPr>
+        <w:t xml:space="preserve"> יְלָדִים </w:t>
+      </w:r>
+      <w:proofErr w:type="spellStart"/>
+      <w:r>
+        <w:rPr>
+          <w:rFonts w:asciiTheme="minorHAnsi" w:hAnsiTheme="minorHAnsi" w:cstheme="minorHAnsi"/>
+          <w:color w:val="0000CC"/>
+          <w:sz w:val="20"/>
+          <w:szCs w:val="20"/>
+          <w:rtl/>
+          <w:lang w:val="he-IL"/>
+        </w:rPr>
+        <w:t>וִילָדוֹת</w:t>
+      </w:r>
+      <w:proofErr w:type="spellEnd"/>
+      <w:r>
+        <w:rPr>
+          <w:rFonts w:asciiTheme="minorHAnsi" w:hAnsiTheme="minorHAnsi" w:cstheme="minorHAnsi"/>
+          <w:color w:val="0000CC"/>
+          <w:sz w:val="20"/>
+          <w:szCs w:val="20"/>
+          <w:rtl/>
+          <w:lang w:val="he-IL"/>
+        </w:rPr>
+        <w:t xml:space="preserve"> </w:t>
+      </w:r>
+      <w:proofErr w:type="spellStart"/>
+      <w:r>
+        <w:rPr>
+          <w:rFonts w:asciiTheme="minorHAnsi" w:hAnsiTheme="minorHAnsi" w:cstheme="minorHAnsi"/>
+          <w:color w:val="0000CC"/>
+          <w:sz w:val="20"/>
+          <w:szCs w:val="20"/>
+          <w:rtl/>
+          <w:lang w:val="he-IL"/>
+        </w:rPr>
+        <w:t>מְשַׂחֲקִים</w:t>
+      </w:r>
+      <w:proofErr w:type="spellEnd"/>
+      <w:r>
+        <w:rPr>
+          <w:rFonts w:asciiTheme="minorHAnsi" w:hAnsiTheme="minorHAnsi" w:cstheme="minorHAnsi"/>
+          <w:color w:val="0000CC"/>
+          <w:sz w:val="20"/>
+          <w:szCs w:val="20"/>
+          <w:rtl/>
+          <w:lang w:val="he-IL"/>
+        </w:rPr>
+        <w:t xml:space="preserve"> </w:t>
+      </w:r>
+      <w:proofErr w:type="spellStart"/>
+      <w:r>
+        <w:rPr>
+          <w:rFonts w:asciiTheme="minorHAnsi" w:hAnsiTheme="minorHAnsi" w:cstheme="minorHAnsi"/>
+          <w:color w:val="0000CC"/>
+          <w:sz w:val="20"/>
+          <w:szCs w:val="20"/>
+          <w:rtl/>
+          <w:lang w:val="he-IL"/>
+        </w:rPr>
+        <w:t>בִּרְחֹבֹתֶיה</w:t>
+      </w:r>
+      <w:proofErr w:type="spellEnd"/>
+      <w:r>
+        <w:rPr>
+          <w:rFonts w:asciiTheme="minorHAnsi" w:hAnsiTheme="minorHAnsi" w:cstheme="minorHAnsi"/>
+          <w:color w:val="0000CC"/>
+          <w:sz w:val="20"/>
+          <w:szCs w:val="20"/>
+          <w:rtl/>
+          <w:lang w:val="he-IL"/>
+        </w:rPr>
+        <w:t>ָ</w:t>
       </w:r>
       <w:r>
         <w:rPr>
@@ -527,14 +647,48 @@
           <w:rtl/>
           <w:lang w:eastAsia="en-US"/>
         </w:rPr>
-        <w:t xml:space="preserve">מטרת הקורס היא ללמד אתכם עקרונות של עיצוב ופיתוח משחקי-מחשב, להכין אתכם לעבודה בתעשיית המשחקים, לאמן אתכם ביצירת פרויקטי תוכנה מורכבים ובעבודת צוות. </w:t>
-      </w:r>
-      <w:r>
-        <w:rPr>
-          <w:rFonts w:ascii="Arial" w:hAnsi="Arial" w:cs="Arial"/>
-          <w:rtl/>
-        </w:rPr>
-        <w:t>הקורס מתחלק לשני חלקים – עיצוב ותיכנות:</w:t>
+        <w:t xml:space="preserve">מטרת הקורס היא ללמד אתכם עקרונות של עיצוב ופיתוח משחקי-מחשב, להכין אתכם לעבודה בתעשיית המשחקים, לאמן אתכם ביצירת </w:t>
+      </w:r>
+      <w:proofErr w:type="spellStart"/>
+      <w:r>
+        <w:rPr>
+          <w:rFonts w:ascii="Arial" w:hAnsi="Arial" w:cs="Arial"/>
+          <w:rtl/>
+          <w:lang w:eastAsia="en-US"/>
+        </w:rPr>
+        <w:t>פרויקטי</w:t>
+      </w:r>
+      <w:proofErr w:type="spellEnd"/>
+      <w:r>
+        <w:rPr>
+          <w:rFonts w:ascii="Arial" w:hAnsi="Arial" w:cs="Arial"/>
+          <w:rtl/>
+          <w:lang w:eastAsia="en-US"/>
+        </w:rPr>
+        <w:t xml:space="preserve"> תוכנה מורכבים ובעבודת צוות. </w:t>
+      </w:r>
+      <w:r>
+        <w:rPr>
+          <w:rFonts w:ascii="Arial" w:hAnsi="Arial" w:cs="Arial"/>
+          <w:rtl/>
+        </w:rPr>
+        <w:t xml:space="preserve">הקורס מתחלק לשני חלקים – עיצוב </w:t>
+      </w:r>
+      <w:proofErr w:type="spellStart"/>
+      <w:r>
+        <w:rPr>
+          <w:rFonts w:ascii="Arial" w:hAnsi="Arial" w:cs="Arial"/>
+          <w:rtl/>
+        </w:rPr>
+        <w:t>ותיכנות</w:t>
+      </w:r>
+      <w:proofErr w:type="spellEnd"/>
+      <w:r>
+        <w:rPr>
+          <w:rFonts w:ascii="Arial" w:hAnsi="Arial" w:cs="Arial"/>
+          <w:rtl/>
+        </w:rPr>
+        <w:t>:</w:t>
       </w:r>
     </w:p>
     <w:p>
@@ -565,7 +719,23 @@
           <w:rFonts w:ascii="Arial" w:hAnsi="Arial" w:cs="Arial"/>
           <w:rtl/>
         </w:rPr>
-        <w:t xml:space="preserve"> ותיכנון של משחקים בכלל ומשחקי מחשב בפרט: איך ממציאים משחקים מקוריים? איך קובעים את חוקי המשחק? וכו'.</w:t>
+        <w:t xml:space="preserve"> ותיכנון של משחקים בכלל ומשחקי מחשב בפרט: איך ממציאים משחקים מקוריים? איך קובעים את חוקי המשחק? </w:t>
+      </w:r>
+      <w:proofErr w:type="spellStart"/>
+      <w:r>
+        <w:rPr>
+          <w:rFonts w:ascii="Arial" w:hAnsi="Arial" w:cs="Arial"/>
+          <w:rtl/>
+        </w:rPr>
+        <w:t>וכו</w:t>
+      </w:r>
+      <w:proofErr w:type="spellEnd"/>
+      <w:r>
+        <w:rPr>
+          <w:rFonts w:ascii="Arial" w:hAnsi="Arial" w:cs="Arial"/>
+          <w:rtl/>
+        </w:rPr>
+        <w:t>'.</w:t>
       </w:r>
     </w:p>
     <w:p>
@@ -582,6 +752,7 @@
         </w:rPr>
         <w:t xml:space="preserve">נלמד על </w:t>
       </w:r>
+      <w:proofErr w:type="spellStart"/>
       <w:r>
         <w:rPr>
           <w:rFonts w:ascii="Arial" w:hAnsi="Arial" w:cs="Arial"/>
@@ -591,6 +762,7 @@
         </w:rPr>
         <w:t>תיכנות</w:t>
       </w:r>
+      <w:proofErr w:type="spellEnd"/>
       <w:r>
         <w:rPr>
           <w:rFonts w:ascii="Arial" w:hAnsi="Arial" w:cs="Arial"/>
@@ -630,6 +802,15 @@
           <w:rtl/>
         </w:rPr>
         <w:t>.</w:t>
+      </w:r>
+    </w:p>
+    <w:p>
+      <w:r>
+        <w:rPr>
+          <w:rFonts w:ascii="Arial" w:hAnsi="Arial" w:cs="Arial" w:hint="cs"/>
+          <w:rtl/>
+        </w:rPr>
+        <w:t>בסוף הקורס, תציגו את המשחק שלכם בפני שופטים מתעשיית המשחקים בישראל.</w:t>
       </w:r>
     </w:p>
     <w:p>
@@ -747,7 +928,25 @@
           <w:kern w:val="2"/>
           <w:rtl/>
         </w:rPr>
-        <w:t xml:space="preserve">לתכנת את המשחק שלכם במערכת יוניטי ובשפת </w:t>
+        <w:t xml:space="preserve">לתכנת את המשחק שלכם במערכת </w:t>
+      </w:r>
+      <w:proofErr w:type="spellStart"/>
+      <w:r>
+        <w:rPr>
+          <w:rFonts w:ascii="Arial" w:eastAsia="Noto Sans CJK SC Regular" w:hAnsi="Arial" w:cs="Arial"/>
+          <w:kern w:val="2"/>
+          <w:rtl/>
+        </w:rPr>
+        <w:t>יוניטי</w:t>
+      </w:r>
+      <w:proofErr w:type="spellEnd"/>
+      <w:r>
+        <w:rPr>
+          <w:rFonts w:ascii="Arial" w:eastAsia="Noto Sans CJK SC Regular" w:hAnsi="Arial" w:cs="Arial"/>
+          <w:kern w:val="2"/>
+          <w:rtl/>
+        </w:rPr>
+        <w:t xml:space="preserve"> ובשפת </w:t>
       </w:r>
       <w:r>
         <w:rPr>
@@ -902,7 +1101,7 @@
     <w:p>
       <w:pPr>
         <w:rPr>
-          <w:rFonts w:ascii="Arial" w:hAnsi="Arial" w:cs="Arial"/>
+          <w:rFonts w:ascii="Arial" w:hAnsi="Arial" w:cs="Arial" w:hint="cs"/>
         </w:rPr>
       </w:pPr>
     </w:p>
@@ -962,13 +1161,53 @@
         </w:rPr>
         <w:t xml:space="preserve">דרישות קדם: </w:t>
       </w:r>
+      <w:proofErr w:type="spellStart"/>
       <w:r>
         <w:rPr>
           <w:rFonts w:ascii="Arial" w:hAnsi="Arial" w:cs="Arial"/>
           <w:rtl/>
           <w:lang w:eastAsia="en-US"/>
         </w:rPr>
-        <w:t xml:space="preserve">תיכנות מונחה עצמים, תיכנות מערכות </w:t>
+        <w:t>תיכנות</w:t>
+      </w:r>
+      <w:proofErr w:type="spellEnd"/>
+      <w:r>
+        <w:rPr>
+          <w:rFonts w:ascii="Arial" w:hAnsi="Arial" w:cs="Arial"/>
+          <w:rtl/>
+          <w:lang w:eastAsia="en-US"/>
+        </w:rPr>
+        <w:t xml:space="preserve"> מונחה עצמים, אלגוריתמים </w:t>
+      </w:r>
+      <w:r>
+        <w:rPr>
+          <w:rFonts w:ascii="Arial" w:hAnsi="Arial" w:cs="Arial"/>
+          <w:lang w:eastAsia="en-US"/>
+        </w:rPr>
+        <w:t>1</w:t>
+      </w:r>
+      <w:r>
+        <w:rPr>
+          <w:rFonts w:ascii="Arial" w:hAnsi="Arial" w:cs="Arial"/>
+          <w:rtl/>
+          <w:lang w:eastAsia="en-US"/>
+        </w:rPr>
+        <w:t xml:space="preserve"> או </w:t>
+      </w:r>
+      <w:r>
+        <w:rPr>
+          <w:rFonts w:ascii="Arial" w:hAnsi="Arial" w:cs="Arial"/>
+          <w:lang w:eastAsia="en-US"/>
+        </w:rPr>
+        <w:t>1</w:t>
+      </w:r>
+      <w:r>
+        <w:rPr>
+          <w:rFonts w:ascii="Arial" w:hAnsi="Arial" w:cs="Arial"/>
+          <w:rtl/>
+          <w:lang w:eastAsia="en-US"/>
+        </w:rPr>
+        <w:t>מ.</w:t>
       </w:r>
       <w:r>
         <w:rPr>
@@ -976,53 +1215,25 @@
           <w:rtl/>
           <w:lang w:eastAsia="en-US"/>
         </w:rPr>
-        <w:t>2</w:t>
-      </w:r>
-      <w:r>
-        <w:rPr>
-          <w:rFonts w:ascii="Arial" w:hAnsi="Arial" w:cs="Arial"/>
+        <w:t xml:space="preserve"> כמוכן, לצורך המטלות דרוש ידע בפקודות </w:t>
+      </w:r>
+      <w:proofErr w:type="spellStart"/>
+      <w:r>
+        <w:rPr>
+          <w:rFonts w:ascii="Arial" w:hAnsi="Arial" w:cs="Arial" w:hint="cs"/>
           <w:rtl/>
           <w:lang w:eastAsia="en-US"/>
         </w:rPr>
-        <w:t xml:space="preserve">, אלגוריתמים </w:t>
-      </w:r>
-      <w:r>
-        <w:rPr>
-          <w:rFonts w:ascii="Arial" w:hAnsi="Arial" w:cs="Arial"/>
+        <w:t>גיט+גיטהאב</w:t>
+      </w:r>
+      <w:proofErr w:type="spellEnd"/>
+      <w:r>
+        <w:rPr>
+          <w:rFonts w:ascii="Arial" w:hAnsi="Arial" w:cs="Arial" w:hint="cs"/>
+          <w:rtl/>
           <w:lang w:eastAsia="en-US"/>
         </w:rPr>
-        <w:t>1</w:t>
-      </w:r>
-      <w:r>
-        <w:rPr>
-          <w:rFonts w:ascii="Arial" w:hAnsi="Arial" w:cs="Arial"/>
-          <w:rtl/>
-          <w:lang w:eastAsia="en-US"/>
-        </w:rPr>
-        <w:t xml:space="preserve"> או </w:t>
-      </w:r>
-      <w:r>
-        <w:rPr>
-          <w:rFonts w:ascii="Arial" w:hAnsi="Arial" w:cs="Arial"/>
-          <w:lang w:eastAsia="en-US"/>
-        </w:rPr>
-        <w:t>1</w:t>
-      </w:r>
-      <w:r>
-        <w:rPr>
-          <w:rFonts w:ascii="Arial" w:hAnsi="Arial" w:cs="Arial"/>
-          <w:rtl/>
-          <w:lang w:eastAsia="en-US"/>
-        </w:rPr>
-        <w:t>מ.</w:t>
-      </w:r>
-      <w:r>
-        <w:rPr>
-          <w:rFonts w:ascii="Arial" w:hAnsi="Arial" w:cs="Arial" w:hint="cs"/>
-          <w:rtl/>
-          <w:lang w:eastAsia="en-US"/>
-        </w:rPr>
-        <w:t xml:space="preserve"> כמוכן, לצורך המטלות דרוש ידע בפקודות גיט+גיטהאב.</w:t>
+        <w:t>.</w:t>
       </w:r>
     </w:p>
     <w:p>
@@ -1285,7 +1496,25 @@
           <w:rtl/>
           <w:lang w:eastAsia="en-US"/>
         </w:rPr>
-        <w:t xml:space="preserve"> שעות (מיכסה: </w:t>
+        <w:t xml:space="preserve"> שעות (</w:t>
+      </w:r>
+      <w:proofErr w:type="spellStart"/>
+      <w:r>
+        <w:rPr>
+          <w:rFonts w:ascii="Arial" w:hAnsi="Arial" w:cs="Arial"/>
+          <w:rtl/>
+          <w:lang w:eastAsia="en-US"/>
+        </w:rPr>
+        <w:t>מיכסה</w:t>
+      </w:r>
+      <w:proofErr w:type="spellEnd"/>
+      <w:r>
+        <w:rPr>
+          <w:rFonts w:ascii="Arial" w:hAnsi="Arial" w:cs="Arial"/>
+          <w:rtl/>
+          <w:lang w:eastAsia="en-US"/>
+        </w:rPr>
+        <w:t xml:space="preserve">: </w:t>
       </w:r>
       <w:r>
         <w:rPr>
@@ -1444,6 +1673,7 @@
           <w:rFonts w:ascii="Arial" w:hAnsi="Arial" w:cs="Arial"/>
           <w:lang w:eastAsia="en-US"/>
         </w:rPr>
+        <w:lastRenderedPageBreak/>
         <w:t>2</w:t>
       </w:r>
       <w:r>
@@ -1502,7 +1732,25 @@
           <w:rtl/>
           <w:lang w:eastAsia="en-US"/>
         </w:rPr>
-        <w:t xml:space="preserve">(מיכסה: </w:t>
+        <w:t>(</w:t>
+      </w:r>
+      <w:proofErr w:type="spellStart"/>
+      <w:r>
+        <w:rPr>
+          <w:rFonts w:ascii="Arial" w:hAnsi="Arial" w:cs="Arial"/>
+          <w:rtl/>
+          <w:lang w:eastAsia="en-US"/>
+        </w:rPr>
+        <w:t>מיכסה</w:t>
+      </w:r>
+      <w:proofErr w:type="spellEnd"/>
+      <w:r>
+        <w:rPr>
+          <w:rFonts w:ascii="Arial" w:hAnsi="Arial" w:cs="Arial"/>
+          <w:rtl/>
+          <w:lang w:eastAsia="en-US"/>
+        </w:rPr>
+        <w:t xml:space="preserve">: </w:t>
       </w:r>
       <w:r>
         <w:rPr>
@@ -1606,7 +1854,6 @@
           <w:rtl/>
           <w:lang w:eastAsia="en-US"/>
         </w:rPr>
-        <w:lastRenderedPageBreak/>
         <w:t xml:space="preserve">3. </w:t>
       </w:r>
       <w:r>
@@ -1772,39 +2019,16 @@
     </w:p>
     <w:p>
       <w:pPr>
-        <w:numPr>
-          <w:ilvl w:val="0"/>
-          <w:numId w:val="4"/>
-        </w:numPr>
         <w:rPr>
           <w:rFonts w:cs="Arial"/>
-        </w:rPr>
-      </w:pPr>
-      <w:r>
-        <w:rPr>
-          <w:rFonts w:cs="Arial"/>
-          <w:rtl/>
-        </w:rPr>
-        <w:t xml:space="preserve">חלק מהציון בקורס הוא תחרותי וניתן לצוותים המצטיינים במטלות – כמו במשחק. לכן הקורס לא מתאים לסטודנטים שרוצים להיות בטוחים לגמרי שיקבלו </w:t>
-      </w:r>
-      <w:r>
-        <w:rPr>
-          <w:rFonts w:cs="Arial"/>
-        </w:rPr>
-        <w:t>100</w:t>
-      </w:r>
-      <w:r>
-        <w:rPr>
-          <w:rFonts w:cs="Arial"/>
-          <w:rtl/>
-        </w:rPr>
-        <w:t>.</w:t>
-      </w:r>
-    </w:p>
-    <w:p>
-      <w:pPr>
-        <w:rPr>
-          <w:rFonts w:cs="Arial"/>
+          <w:rtl/>
+        </w:rPr>
+      </w:pPr>
+    </w:p>
+    <w:p>
+      <w:pPr>
+        <w:rPr>
+          <w:rFonts w:cs="Arial" w:hint="cs"/>
           <w:rtl/>
         </w:rPr>
       </w:pPr>
@@ -1865,11 +2089,11 @@
           <w:szCs w:val="28"/>
           <w:rtl/>
         </w:rPr>
-        <w:t>לימודים ו</w:t>
-      </w:r>
-      <w:r>
-        <w:rPr>
-          <w:rFonts w:ascii="Arial" w:hAnsi="Arial" w:cs="Arial"/>
+        <w:t xml:space="preserve">לימודים </w:t>
+      </w:r>
+      <w:r>
+        <w:rPr>
+          <w:rFonts w:ascii="Arial" w:hAnsi="Arial" w:cs="Arial" w:hint="cs"/>
           <w:b/>
           <w:bCs/>
           <w:color w:val="0000FF"/>
@@ -1877,7 +2101,7 @@
           <w:szCs w:val="28"/>
           <w:rtl/>
         </w:rPr>
-        <w:t>מטלות</w:t>
+        <w:t>ושלבי עבודה</w:t>
       </w:r>
     </w:p>
     <w:p>
@@ -1896,29 +2120,7 @@
           <w:rFonts w:ascii="Arial" w:hAnsi="Arial" w:cs="Arial" w:hint="cs"/>
           <w:rtl/>
         </w:rPr>
-        <w:t xml:space="preserve">כרגע מתוכננות </w:t>
-      </w:r>
-      <w:r>
-        <w:rPr>
-          <w:rFonts w:ascii="Arial" w:hAnsi="Arial" w:cs="Arial"/>
-        </w:rPr>
-        <w:t>18</w:t>
-      </w:r>
-      <w:r>
-        <w:rPr>
-          <w:rFonts w:ascii="Arial" w:hAnsi="Arial" w:cs="Arial" w:hint="cs"/>
-          <w:rtl/>
-        </w:rPr>
-        <w:t xml:space="preserve"> מטלות. </w:t>
-      </w:r>
-      <w:r>
-        <w:rPr>
-          <w:rFonts w:ascii="Arial" w:hAnsi="Arial" w:cs="Arial"/>
-          <w:b/>
-          <w:bCs/>
-          <w:rtl/>
-        </w:rPr>
-        <w:t>התוכנית עשויה להשתנות במהלך הסמסטר.</w:t>
+        <w:t>בקורס תהיה מטלה אחת מתגלגלת, המחולקת לשלבי עבודה. בכל שבוע תגישו שלב אחד.</w:t>
       </w:r>
     </w:p>
     <w:p>
@@ -1941,8 +2143,8 @@
       <w:tblGrid>
         <w:gridCol w:w="2600"/>
         <w:gridCol w:w="2414"/>
-        <w:gridCol w:w="2592"/>
-        <w:gridCol w:w="51"/>
+        <w:gridCol w:w="2593"/>
+        <w:gridCol w:w="50"/>
         <w:gridCol w:w="2525"/>
       </w:tblGrid>
       <w:tr>
@@ -2388,60 +2590,17 @@
           </w:tcPr>
           <w:p>
             <w:pPr>
+              <w:pStyle w:val="ListParagraph"/>
+              <w:numPr>
+                <w:ilvl w:val="0"/>
+                <w:numId w:val="8"/>
+              </w:numPr>
               <w:suppressAutoHyphens w:val="0"/>
               <w:spacing w:before="57" w:after="57"/>
               <w:rPr>
                 <w:rFonts w:ascii="Arial" w:hAnsi="Arial" w:cs="Arial"/>
-                <w:color w:val="00B050"/>
-                <w:rtl/>
               </w:rPr>
             </w:pPr>
-            <w:r>
-              <w:rPr>
-                <w:rFonts w:ascii="Arial" w:hAnsi="Arial" w:cs="Arial" w:hint="cs"/>
-                <w:color w:val="00B050"/>
-                <w:rtl/>
-              </w:rPr>
-              <w:t>תרגול 2</w:t>
-            </w:r>
-            <w:r>
-              <w:rPr>
-                <w:rFonts w:ascii="Arial" w:hAnsi="Arial" w:cs="Arial" w:hint="cs"/>
-                <w:color w:val="00B050"/>
-                <w:rtl/>
-              </w:rPr>
-              <w:t xml:space="preserve"> </w:t>
-            </w:r>
-            <w:r>
-              <w:rPr>
-                <w:rFonts w:ascii="Arial" w:hAnsi="Arial" w:cs="Arial" w:hint="cs"/>
-                <w:color w:val="00B050"/>
-                <w:sz w:val="18"/>
-                <w:szCs w:val="18"/>
-                <w:rtl/>
-              </w:rPr>
-              <w:t>[</w:t>
-            </w:r>
-            <w:r>
-              <w:rPr>
-                <w:rFonts w:ascii="Arial" w:hAnsi="Arial" w:cs="Arial" w:hint="cs"/>
-                <w:color w:val="00B050"/>
-                <w:sz w:val="18"/>
-                <w:szCs w:val="18"/>
-                <w:rtl/>
-              </w:rPr>
-              <w:t>לשתי קבוצות ה</w:t>
-            </w:r>
-            <w:r>
-              <w:rPr>
-                <w:rFonts w:ascii="Arial" w:hAnsi="Arial" w:cs="Arial" w:hint="cs"/>
-                <w:color w:val="00B050"/>
-                <w:sz w:val="18"/>
-                <w:szCs w:val="18"/>
-                <w:rtl/>
-              </w:rPr>
-              <w:t>תרגול]</w:t>
-            </w:r>
           </w:p>
         </w:tc>
         <w:tc>
@@ -2454,41 +2613,96 @@
               <w:spacing w:before="57" w:after="57"/>
               <w:rPr>
                 <w:rFonts w:ascii="Arial" w:hAnsi="Arial" w:cs="Arial"/>
-                <w:color w:val="00B050"/>
                 <w:rtl/>
               </w:rPr>
             </w:pPr>
-            <w:r>
-              <w:rPr>
-                <w:rFonts w:ascii="Arial" w:hAnsi="Arial" w:cs="Arial" w:hint="cs"/>
-                <w:color w:val="00B050"/>
-                <w:rtl/>
-              </w:rPr>
-              <w:t xml:space="preserve">הרצאת אורח </w:t>
-            </w:r>
-            <w:r>
-              <w:rPr>
-                <w:rFonts w:ascii="Arial" w:hAnsi="Arial" w:cs="Arial"/>
-                <w:color w:val="00B050"/>
-                <w:rtl/>
-              </w:rPr>
-              <w:t>–</w:t>
-            </w:r>
-            <w:r>
-              <w:rPr>
-                <w:rFonts w:ascii="Arial" w:hAnsi="Arial" w:cs="Arial" w:hint="cs"/>
-                <w:color w:val="00B050"/>
-                <w:rtl/>
-              </w:rPr>
-              <w:t xml:space="preserve"> תעשיית המשחקים הישראלית</w:t>
-            </w:r>
-            <w:r>
-              <w:rPr>
-                <w:rFonts w:ascii="Arial" w:hAnsi="Arial" w:cs="Arial" w:hint="cs"/>
-                <w:color w:val="00B050"/>
-                <w:rtl/>
-              </w:rPr>
-              <w:t>. נוכחות חובה</w:t>
+            <w:proofErr w:type="spellStart"/>
+            <w:r>
+              <w:rPr>
+                <w:rFonts w:ascii="Arial" w:hAnsi="Arial" w:cs="Arial"/>
+                <w:rtl/>
+              </w:rPr>
+              <w:t>תיכנות</w:t>
+            </w:r>
+            <w:proofErr w:type="spellEnd"/>
+            <w:r>
+              <w:rPr>
+                <w:rFonts w:ascii="Arial" w:hAnsi="Arial" w:cs="Arial"/>
+                <w:rtl/>
+              </w:rPr>
+              <w:t>:</w:t>
+            </w:r>
+            <w:r>
+              <w:rPr>
+                <w:rFonts w:ascii="Arial" w:hAnsi="Arial" w:cs="Arial" w:hint="cs"/>
+                <w:rtl/>
+              </w:rPr>
+              <w:t xml:space="preserve"> עצמים ורכיבים </w:t>
+            </w:r>
+            <w:proofErr w:type="spellStart"/>
+            <w:r>
+              <w:rPr>
+                <w:rFonts w:ascii="Arial" w:hAnsi="Arial" w:cs="Arial" w:hint="cs"/>
+                <w:rtl/>
+              </w:rPr>
+              <w:t>ביוניטי</w:t>
+            </w:r>
+            <w:proofErr w:type="spellEnd"/>
+            <w:r>
+              <w:rPr>
+                <w:rFonts w:ascii="Arial" w:hAnsi="Arial" w:cs="Arial" w:hint="cs"/>
+                <w:rtl/>
+              </w:rPr>
+              <w:t>.</w:t>
+            </w:r>
+          </w:p>
+          <w:p>
+            <w:pPr>
+              <w:suppressAutoHyphens w:val="0"/>
+              <w:spacing w:before="57" w:after="57"/>
+              <w:rPr>
+                <w:rFonts w:ascii="Arial" w:hAnsi="Arial" w:cs="Arial"/>
+                <w:rtl/>
+              </w:rPr>
+            </w:pPr>
+            <w:r>
+              <w:rPr>
+                <w:rFonts w:ascii="Arial" w:hAnsi="Arial" w:cs="Arial" w:hint="cs"/>
+                <w:rtl/>
+              </w:rPr>
+              <w:t>בניה לניידים.</w:t>
+            </w:r>
+          </w:p>
+          <w:p>
+            <w:pPr>
+              <w:suppressAutoHyphens w:val="0"/>
+              <w:spacing w:before="57" w:after="57"/>
+              <w:rPr>
+                <w:rFonts w:ascii="Arial" w:hAnsi="Arial" w:cs="Arial"/>
+              </w:rPr>
+            </w:pPr>
+            <w:r>
+              <w:rPr>
+                <w:rFonts w:ascii="Arial" w:hAnsi="Arial" w:cs="Arial" w:hint="cs"/>
+                <w:rtl/>
+              </w:rPr>
+              <w:t xml:space="preserve">עבודה עם </w:t>
+            </w:r>
+            <w:proofErr w:type="spellStart"/>
+            <w:r>
+              <w:rPr>
+                <w:rFonts w:ascii="Arial" w:hAnsi="Arial" w:cs="Arial" w:hint="cs"/>
+                <w:rtl/>
+              </w:rPr>
+              <w:t>ב"מ</w:t>
+            </w:r>
+            <w:proofErr w:type="spellEnd"/>
+            <w:r>
+              <w:rPr>
+                <w:rFonts w:ascii="Arial" w:hAnsi="Arial" w:cs="Arial" w:hint="cs"/>
+                <w:rtl/>
+              </w:rPr>
+              <w:t>.</w:t>
             </w:r>
           </w:p>
         </w:tc>
@@ -2503,10 +2717,32 @@
               <w:spacing w:before="57" w:after="57"/>
               <w:rPr>
                 <w:rFonts w:ascii="Arial" w:hAnsi="Arial" w:cs="Arial"/>
-                <w:color w:val="00B050"/>
                 <w:rtl/>
               </w:rPr>
             </w:pPr>
+            <w:r>
+              <w:rPr>
+                <w:rFonts w:ascii="Arial" w:hAnsi="Arial" w:cs="Arial"/>
+                <w:rtl/>
+              </w:rPr>
+              <w:t xml:space="preserve">רכיבים </w:t>
+            </w:r>
+            <w:proofErr w:type="spellStart"/>
+            <w:r>
+              <w:rPr>
+                <w:rFonts w:ascii="Arial" w:hAnsi="Arial" w:cs="Arial"/>
+                <w:rtl/>
+              </w:rPr>
+              <w:t>ביוניטי</w:t>
+            </w:r>
+            <w:proofErr w:type="spellEnd"/>
+            <w:r>
+              <w:rPr>
+                <w:rFonts w:ascii="Arial" w:hAnsi="Arial" w:cs="Arial" w:hint="cs"/>
+                <w:rtl/>
+              </w:rPr>
+              <w:t xml:space="preserve"> (3)</w:t>
+            </w:r>
           </w:p>
         </w:tc>
         <w:tc>
@@ -2519,10 +2755,16 @@
               <w:spacing w:before="57" w:after="57"/>
               <w:rPr>
                 <w:rFonts w:ascii="Arial" w:hAnsi="Arial" w:cs="Arial"/>
-                <w:color w:val="00B050"/>
                 <w:rtl/>
               </w:rPr>
             </w:pPr>
+            <w:r>
+              <w:rPr>
+                <w:rFonts w:ascii="Arial" w:hAnsi="Arial" w:cs="Arial" w:hint="cs"/>
+                <w:rtl/>
+              </w:rPr>
+              <w:t>סקר שוק (3).</w:t>
+            </w:r>
           </w:p>
         </w:tc>
       </w:tr>
@@ -2556,27 +2798,197 @@
               <w:spacing w:before="57" w:after="57"/>
               <w:rPr>
                 <w:rFonts w:ascii="Arial" w:hAnsi="Arial" w:cs="Arial"/>
+                <w:rtl/>
               </w:rPr>
             </w:pPr>
-            <w:r>
-              <w:rPr>
-                <w:rFonts w:ascii="Arial" w:hAnsi="Arial" w:cs="Arial"/>
-                <w:rtl/>
-              </w:rPr>
-              <w:t>תיכנות:</w:t>
-            </w:r>
-            <w:r>
-              <w:rPr>
-                <w:rFonts w:ascii="Arial" w:hAnsi="Arial" w:cs="Arial" w:hint="cs"/>
-                <w:rtl/>
-              </w:rPr>
-              <w:t xml:space="preserve"> עצמים ורכיבים ביוניטי.</w:t>
+            <w:proofErr w:type="spellStart"/>
+            <w:r>
+              <w:rPr>
+                <w:rFonts w:ascii="Arial" w:hAnsi="Arial" w:cs="Arial"/>
+                <w:rtl/>
+              </w:rPr>
+              <w:t>תיכנות</w:t>
+            </w:r>
+            <w:proofErr w:type="spellEnd"/>
+            <w:r>
+              <w:rPr>
+                <w:rFonts w:ascii="Arial" w:hAnsi="Arial" w:cs="Arial"/>
+                <w:rtl/>
+              </w:rPr>
+              <w:t>: טריגרים</w:t>
+            </w:r>
+            <w:r>
+              <w:rPr>
+                <w:rFonts w:ascii="Arial" w:hAnsi="Arial" w:cs="Arial" w:hint="cs"/>
+                <w:rtl/>
+              </w:rPr>
+              <w:t>;</w:t>
+            </w:r>
+          </w:p>
+          <w:p>
+            <w:pPr>
+              <w:suppressAutoHyphens w:val="0"/>
+              <w:spacing w:before="57" w:after="57"/>
+              <w:rPr>
+                <w:rFonts w:ascii="Arial" w:hAnsi="Arial" w:cs="Arial"/>
+                <w:rtl/>
+              </w:rPr>
+            </w:pPr>
+            <w:r>
+              <w:rPr>
+                <w:rFonts w:ascii="Arial" w:hAnsi="Arial" w:cs="Arial" w:hint="cs"/>
+                <w:rtl/>
+              </w:rPr>
+              <w:t>(ממשק משתמש?).</w:t>
+            </w:r>
+          </w:p>
+          <w:p>
+            <w:pPr>
+              <w:suppressAutoHyphens w:val="0"/>
+              <w:spacing w:before="57" w:after="57"/>
+              <w:rPr>
+                <w:rFonts w:ascii="Arial" w:hAnsi="Arial" w:cs="Arial"/>
+                <w:rtl/>
+              </w:rPr>
+            </w:pPr>
+          </w:p>
+          <w:p>
+            <w:pPr>
+              <w:suppressAutoHyphens w:val="0"/>
+              <w:spacing w:before="57" w:after="57"/>
+              <w:rPr>
+                <w:rFonts w:ascii="Arial" w:hAnsi="Arial" w:cs="Arial"/>
+              </w:rPr>
+            </w:pPr>
+            <w:proofErr w:type="spellStart"/>
+            <w:r>
+              <w:rPr>
+                <w:rFonts w:ascii="Arial" w:hAnsi="Arial" w:cs="Arial" w:hint="cs"/>
+                <w:rtl/>
+              </w:rPr>
+              <w:t>תיכנות</w:t>
+            </w:r>
+            <w:proofErr w:type="spellEnd"/>
+            <w:r>
+              <w:rPr>
+                <w:rFonts w:ascii="Arial" w:hAnsi="Arial" w:cs="Arial" w:hint="cs"/>
+                <w:rtl/>
+              </w:rPr>
+              <w:t>:</w:t>
+            </w:r>
+            <w:r>
+              <w:rPr>
+                <w:rFonts w:ascii="Arial" w:hAnsi="Arial" w:cs="Arial"/>
+              </w:rPr>
+              <w:t xml:space="preserve"> </w:t>
+            </w:r>
+            <w:r>
+              <w:rPr>
+                <w:rFonts w:ascii="Arial" w:hAnsi="Arial" w:cs="Arial" w:hint="cs"/>
+                <w:rtl/>
+              </w:rPr>
+              <w:t xml:space="preserve">ממשק משתמש </w:t>
+            </w:r>
+            <w:r>
+              <w:rPr>
+                <w:rFonts w:ascii="Arial" w:hAnsi="Arial" w:cs="Arial"/>
+                <w:rtl/>
+              </w:rPr>
+              <w:t>–</w:t>
+            </w:r>
+            <w:r>
+              <w:rPr>
+                <w:rFonts w:ascii="Arial" w:hAnsi="Arial" w:cs="Arial" w:hint="cs"/>
+                <w:rtl/>
+              </w:rPr>
+              <w:t xml:space="preserve"> </w:t>
+            </w:r>
+            <w:r>
+              <w:rPr>
+                <w:rFonts w:ascii="Arial" w:hAnsi="Arial" w:cs="Arial"/>
+              </w:rPr>
+              <w:t>Canvas</w:t>
+            </w:r>
+            <w:r>
+              <w:rPr>
+                <w:rFonts w:ascii="Arial" w:hAnsi="Arial" w:cs="Arial" w:hint="cs"/>
+                <w:rtl/>
+              </w:rPr>
+              <w:t>, נתוני שחקן, שמירת העדפות שחקן (בענן?).</w:t>
             </w:r>
           </w:p>
         </w:tc>
         <w:tc>
           <w:tcPr>
-            <w:tcW w:w="2643" w:type="dxa"/>
+            <w:tcW w:w="2593" w:type="dxa"/>
+          </w:tcPr>
+          <w:p>
+            <w:pPr>
+              <w:suppressAutoHyphens w:val="0"/>
+              <w:spacing w:before="57" w:after="57"/>
+              <w:rPr>
+                <w:rFonts w:ascii="Arial" w:hAnsi="Arial" w:cs="Arial"/>
+                <w:rtl/>
+              </w:rPr>
+            </w:pPr>
+            <w:r>
+              <w:rPr>
+                <w:rFonts w:ascii="Arial" w:hAnsi="Arial" w:cs="Arial"/>
+                <w:rtl/>
+              </w:rPr>
+              <w:t xml:space="preserve">תהליכי ליבה </w:t>
+            </w:r>
+            <w:proofErr w:type="spellStart"/>
+            <w:r>
+              <w:rPr>
+                <w:rFonts w:ascii="Arial" w:hAnsi="Arial" w:cs="Arial"/>
+                <w:rtl/>
+              </w:rPr>
+              <w:t>ביוניטי</w:t>
+            </w:r>
+            <w:proofErr w:type="spellEnd"/>
+            <w:r>
+              <w:rPr>
+                <w:rFonts w:ascii="Arial" w:hAnsi="Arial" w:cs="Arial" w:hint="cs"/>
+                <w:rtl/>
+              </w:rPr>
+              <w:t xml:space="preserve"> </w:t>
+            </w:r>
+            <w:r>
+              <w:rPr>
+                <w:rFonts w:ascii="Arial" w:hAnsi="Arial" w:cs="Arial"/>
+                <w:rtl/>
+              </w:rPr>
+              <w:t>–</w:t>
+            </w:r>
+            <w:r>
+              <w:rPr>
+                <w:rFonts w:ascii="Arial" w:hAnsi="Arial" w:cs="Arial" w:hint="cs"/>
+                <w:rtl/>
+              </w:rPr>
+              <w:t xml:space="preserve"> </w:t>
+            </w:r>
+            <w:r>
+              <w:rPr>
+                <w:rFonts w:ascii="Arial" w:hAnsi="Arial" w:cs="Arial" w:hint="cs"/>
+                <w:i/>
+                <w:iCs/>
+                <w:rtl/>
+              </w:rPr>
+              <w:t>הגשה אישית</w:t>
+            </w:r>
+            <w:r>
+              <w:rPr>
+                <w:rFonts w:ascii="Arial" w:hAnsi="Arial" w:cs="Arial" w:hint="cs"/>
+                <w:rtl/>
+              </w:rPr>
+              <w:t xml:space="preserve"> (3).</w:t>
+            </w:r>
+          </w:p>
+        </w:tc>
+        <w:tc>
+          <w:tcPr>
+            <w:tcW w:w="2575" w:type="dxa"/>
             <w:gridSpan w:val="2"/>
           </w:tcPr>
           <w:p>
@@ -2585,44 +2997,23 @@
               <w:spacing w:before="57" w:after="57"/>
               <w:rPr>
                 <w:rFonts w:ascii="Arial" w:hAnsi="Arial" w:cs="Arial"/>
-                <w:rtl/>
+                <w:i/>
+                <w:iCs/>
               </w:rPr>
             </w:pPr>
             <w:r>
               <w:rPr>
-                <w:rFonts w:ascii="Arial" w:hAnsi="Arial" w:cs="Arial"/>
-                <w:rtl/>
-              </w:rPr>
-              <w:t>רכיבים ביוניטי</w:t>
-            </w:r>
-            <w:r>
-              <w:rPr>
-                <w:rFonts w:ascii="Arial" w:hAnsi="Arial" w:cs="Arial" w:hint="cs"/>
-                <w:rtl/>
-              </w:rPr>
-              <w:t xml:space="preserve"> (3)</w:t>
-            </w:r>
-          </w:p>
-        </w:tc>
-        <w:tc>
-          <w:tcPr>
-            <w:tcW w:w="2525" w:type="dxa"/>
-          </w:tcPr>
-          <w:p>
-            <w:pPr>
-              <w:suppressAutoHyphens w:val="0"/>
-              <w:spacing w:before="57" w:after="57"/>
-              <w:rPr>
-                <w:rFonts w:ascii="Arial" w:hAnsi="Arial" w:cs="Arial"/>
-                <w:rtl/>
-              </w:rPr>
-            </w:pPr>
-            <w:r>
-              <w:rPr>
-                <w:rFonts w:ascii="Arial" w:hAnsi="Arial" w:cs="Arial" w:hint="cs"/>
-                <w:rtl/>
-              </w:rPr>
-              <w:t>סקר שוק (3).</w:t>
+                <w:rFonts w:ascii="Arial" w:hAnsi="Arial" w:cs="Arial" w:hint="cs"/>
+                <w:rtl/>
+              </w:rPr>
+              <w:t>תכנון רמות</w:t>
+            </w:r>
+            <w:r>
+              <w:rPr>
+                <w:rFonts w:ascii="Arial" w:hAnsi="Arial" w:cs="Arial" w:hint="cs"/>
+                <w:rtl/>
+              </w:rPr>
+              <w:t xml:space="preserve"> (3).</w:t>
             </w:r>
           </w:p>
         </w:tc>
@@ -2660,19 +3051,28 @@
                 <w:rtl/>
               </w:rPr>
             </w:pPr>
-            <w:r>
-              <w:rPr>
-                <w:rFonts w:ascii="Arial" w:hAnsi="Arial" w:cs="Arial"/>
-                <w:rtl/>
-              </w:rPr>
-              <w:t>תיכנות: טריגרים</w:t>
-            </w:r>
-            <w:r>
-              <w:rPr>
-                <w:rFonts w:ascii="Arial" w:hAnsi="Arial" w:cs="Arial" w:hint="cs"/>
-                <w:rtl/>
-              </w:rPr>
-              <w:t>;</w:t>
+            <w:proofErr w:type="spellStart"/>
+            <w:r>
+              <w:rPr>
+                <w:rFonts w:ascii="Arial" w:hAnsi="Arial" w:cs="Arial"/>
+                <w:rtl/>
+              </w:rPr>
+              <w:t>תיכנות</w:t>
+            </w:r>
+            <w:proofErr w:type="spellEnd"/>
+            <w:r>
+              <w:rPr>
+                <w:rFonts w:ascii="Arial" w:hAnsi="Arial" w:cs="Arial"/>
+                <w:rtl/>
+              </w:rPr>
+              <w:t>: מנוע פיסיקלי</w:t>
+            </w:r>
+            <w:r>
+              <w:rPr>
+                <w:rFonts w:ascii="Arial" w:hAnsi="Arial" w:cs="Arial" w:hint="cs"/>
+                <w:rtl/>
+              </w:rPr>
+              <w:t>.</w:t>
             </w:r>
           </w:p>
           <w:p>
@@ -2688,72 +3088,26 @@
                 <w:rFonts w:ascii="Arial" w:hAnsi="Arial" w:cs="Arial" w:hint="cs"/>
                 <w:rtl/>
               </w:rPr>
-              <w:t>(ממשק משתמש?).</w:t>
+              <w:t>(</w:t>
+            </w:r>
+            <w:r>
+              <w:rPr>
+                <w:rFonts w:ascii="Arial" w:hAnsi="Arial" w:cs="Arial"/>
+              </w:rPr>
+              <w:t>Scriptable object</w:t>
+            </w:r>
+            <w:r>
+              <w:rPr>
+                <w:rFonts w:ascii="Arial" w:hAnsi="Arial" w:cs="Arial" w:hint="cs"/>
+                <w:rtl/>
+              </w:rPr>
+              <w:t>?)</w:t>
             </w:r>
           </w:p>
         </w:tc>
         <w:tc>
           <w:tcPr>
-            <w:tcW w:w="2592" w:type="dxa"/>
-          </w:tcPr>
-          <w:p>
-            <w:pPr>
-              <w:suppressAutoHyphens w:val="0"/>
-              <w:spacing w:before="57" w:after="57"/>
-              <w:rPr>
-                <w:rFonts w:ascii="Arial" w:hAnsi="Arial" w:cs="Arial"/>
-                <w:rtl/>
-              </w:rPr>
-            </w:pPr>
-            <w:r>
-              <w:rPr>
-                <w:rFonts w:ascii="Arial" w:hAnsi="Arial" w:cs="Arial"/>
-                <w:rtl/>
-              </w:rPr>
-              <w:t>תהליכי ליבה ביוניטי</w:t>
-            </w:r>
-            <w:r>
-              <w:rPr>
-                <w:rFonts w:ascii="Arial" w:hAnsi="Arial" w:cs="Arial" w:hint="cs"/>
-                <w:rtl/>
-              </w:rPr>
-              <w:t xml:space="preserve"> </w:t>
-            </w:r>
-            <w:r>
-              <w:rPr>
-                <w:rFonts w:ascii="Arial" w:hAnsi="Arial" w:cs="Arial"/>
-                <w:rtl/>
-              </w:rPr>
-              <w:t>–</w:t>
-            </w:r>
-            <w:r>
-              <w:rPr>
-                <w:rFonts w:ascii="Arial" w:hAnsi="Arial" w:cs="Arial" w:hint="cs"/>
-                <w:rtl/>
-              </w:rPr>
-              <w:t xml:space="preserve"> </w:t>
-            </w:r>
-            <w:r>
-              <w:rPr>
-                <w:rFonts w:ascii="Arial" w:hAnsi="Arial" w:cs="Arial" w:hint="cs"/>
-                <w:i/>
-                <w:iCs/>
-                <w:rtl/>
-              </w:rPr>
-              <w:t>הגשה אישית</w:t>
-            </w:r>
-            <w:r>
-              <w:rPr>
-                <w:rFonts w:ascii="Arial" w:hAnsi="Arial" w:cs="Arial" w:hint="cs"/>
-                <w:rtl/>
-              </w:rPr>
-              <w:t xml:space="preserve"> (3).</w:t>
-            </w:r>
-          </w:p>
-        </w:tc>
-        <w:tc>
-          <w:tcPr>
-            <w:tcW w:w="2576" w:type="dxa"/>
+            <w:tcW w:w="2643" w:type="dxa"/>
             <w:gridSpan w:val="2"/>
           </w:tcPr>
           <w:p>
@@ -2762,23 +3116,105 @@
               <w:spacing w:before="57" w:after="57"/>
               <w:rPr>
                 <w:rFonts w:ascii="Arial" w:hAnsi="Arial" w:cs="Arial"/>
-                <w:i/>
-                <w:iCs/>
               </w:rPr>
             </w:pPr>
             <w:r>
               <w:rPr>
-                <w:rFonts w:ascii="Arial" w:hAnsi="Arial" w:cs="Arial" w:hint="cs"/>
-                <w:rtl/>
-              </w:rPr>
-              <w:t>תכנון רמות</w:t>
-            </w:r>
-            <w:r>
-              <w:rPr>
-                <w:rFonts w:ascii="Arial" w:hAnsi="Arial" w:cs="Arial" w:hint="cs"/>
-                <w:rtl/>
-              </w:rPr>
-              <w:t xml:space="preserve"> (3).</w:t>
+                <w:rFonts w:ascii="Arial" w:hAnsi="Arial" w:cs="Arial"/>
+                <w:rtl/>
+              </w:rPr>
+              <w:t xml:space="preserve">פיסיקה </w:t>
+            </w:r>
+            <w:proofErr w:type="spellStart"/>
+            <w:r>
+              <w:rPr>
+                <w:rFonts w:ascii="Arial" w:hAnsi="Arial" w:cs="Arial"/>
+                <w:rtl/>
+              </w:rPr>
+              <w:t>ביוניטי</w:t>
+            </w:r>
+            <w:proofErr w:type="spellEnd"/>
+            <w:r>
+              <w:rPr>
+                <w:rFonts w:ascii="Arial" w:hAnsi="Arial" w:cs="Arial" w:hint="cs"/>
+                <w:rtl/>
+              </w:rPr>
+              <w:t xml:space="preserve"> </w:t>
+            </w:r>
+            <w:r>
+              <w:rPr>
+                <w:rFonts w:ascii="Arial" w:hAnsi="Arial" w:cs="Arial"/>
+              </w:rPr>
+              <w:t xml:space="preserve">  </w:t>
+            </w:r>
+            <w:r>
+              <w:rPr>
+                <w:rFonts w:ascii="Arial" w:hAnsi="Arial" w:cs="Arial" w:hint="cs"/>
+                <w:rtl/>
+              </w:rPr>
+              <w:t xml:space="preserve">+  ארכיטקטורת קוד </w:t>
+            </w:r>
+            <w:r>
+              <w:rPr>
+                <w:rFonts w:ascii="Arial" w:hAnsi="Arial" w:cs="Arial" w:hint="cs"/>
+                <w:rtl/>
+              </w:rPr>
+              <w:t>(3)</w:t>
+            </w:r>
+          </w:p>
+        </w:tc>
+        <w:tc>
+          <w:tcPr>
+            <w:tcW w:w="2525" w:type="dxa"/>
+          </w:tcPr>
+          <w:p>
+            <w:pPr>
+              <w:suppressAutoHyphens w:val="0"/>
+              <w:spacing w:before="57" w:after="57"/>
+              <w:rPr>
+                <w:rFonts w:ascii="Arial" w:hAnsi="Arial" w:cs="Arial"/>
+              </w:rPr>
+            </w:pPr>
+            <w:r>
+              <w:rPr>
+                <w:rFonts w:ascii="Arial" w:hAnsi="Arial" w:cs="Arial" w:hint="cs"/>
+                <w:rtl/>
+              </w:rPr>
+              <w:t>מימוש תהלי</w:t>
+            </w:r>
+            <w:r>
+              <w:rPr>
+                <w:rFonts w:ascii="Arial" w:hAnsi="Arial" w:cs="Arial" w:hint="cs"/>
+                <w:rtl/>
+              </w:rPr>
+              <w:t>כי</w:t>
+            </w:r>
+            <w:r>
+              <w:rPr>
+                <w:rFonts w:ascii="Arial" w:hAnsi="Arial" w:cs="Arial" w:hint="cs"/>
+                <w:rtl/>
+              </w:rPr>
+              <w:t xml:space="preserve"> הליבה</w:t>
+            </w:r>
+            <w:r>
+              <w:rPr>
+                <w:rFonts w:ascii="Arial" w:hAnsi="Arial" w:cs="Arial" w:hint="cs"/>
+                <w:rtl/>
+              </w:rPr>
+              <w:t xml:space="preserve"> +</w:t>
+            </w:r>
+            <w:r>
+              <w:rPr>
+                <w:rFonts w:ascii="Arial" w:hAnsi="Arial" w:cs="Arial"/>
+              </w:rPr>
+              <w:t xml:space="preserve"> </w:t>
+            </w:r>
+            <w:r>
+              <w:rPr>
+                <w:rFonts w:ascii="Arial" w:hAnsi="Arial" w:cs="Arial" w:hint="cs"/>
+                <w:rtl/>
+              </w:rPr>
+              <w:t>ארכיטקטורת קוד (3)</w:t>
             </w:r>
           </w:p>
         </w:tc>
@@ -2813,7 +3249,6 @@
               <w:spacing w:before="57" w:after="57"/>
               <w:rPr>
                 <w:rFonts w:ascii="Arial" w:hAnsi="Arial" w:cs="Arial"/>
-                <w:rtl/>
               </w:rPr>
             </w:pPr>
             <w:r>
@@ -2821,7 +3256,7 @@
                 <w:rFonts w:ascii="Arial" w:hAnsi="Arial" w:cs="Arial"/>
                 <w:rtl/>
               </w:rPr>
-              <w:t>תיכנות: מנוע פיסיקלי</w:t>
+              <w:t>עיצוב: רכיבים דרמטיים</w:t>
             </w:r>
             <w:r>
               <w:rPr>
@@ -2829,35 +3264,6 @@
                 <w:rtl/>
               </w:rPr>
               <w:t>.</w:t>
-            </w:r>
-          </w:p>
-          <w:p>
-            <w:pPr>
-              <w:suppressAutoHyphens w:val="0"/>
-              <w:spacing w:before="57" w:after="57"/>
-              <w:rPr>
-                <w:rFonts w:ascii="Arial" w:hAnsi="Arial" w:cs="Arial"/>
-              </w:rPr>
-            </w:pPr>
-            <w:r>
-              <w:rPr>
-                <w:rFonts w:ascii="Arial" w:hAnsi="Arial" w:cs="Arial" w:hint="cs"/>
-                <w:rtl/>
-              </w:rPr>
-              <w:t>(</w:t>
-            </w:r>
-            <w:r>
-              <w:rPr>
-                <w:rFonts w:ascii="Arial" w:hAnsi="Arial" w:cs="Arial"/>
-              </w:rPr>
-              <w:t>Scriptable object</w:t>
-            </w:r>
-            <w:r>
-              <w:rPr>
-                <w:rFonts w:ascii="Arial" w:hAnsi="Arial" w:cs="Arial" w:hint="cs"/>
-                <w:rtl/>
-              </w:rPr>
-              <w:t>?)</w:t>
             </w:r>
           </w:p>
         </w:tc>
@@ -2876,37 +3282,26 @@
             </w:pPr>
             <w:r>
               <w:rPr>
-                <w:rFonts w:ascii="Arial" w:hAnsi="Arial" w:cs="Arial"/>
-                <w:rtl/>
-              </w:rPr>
-              <w:t>פיסיקה ביוניטי</w:t>
-            </w:r>
-            <w:r>
-              <w:rPr>
-                <w:rFonts w:ascii="Arial" w:hAnsi="Arial" w:cs="Arial" w:hint="cs"/>
-                <w:rtl/>
-              </w:rPr>
-              <w:t xml:space="preserve"> </w:t>
-            </w:r>
-            <w:r>
-              <w:rPr>
-                <w:rFonts w:ascii="Arial" w:hAnsi="Arial" w:cs="Arial"/>
-              </w:rPr>
-              <w:t xml:space="preserve">  </w:t>
-            </w:r>
-            <w:r>
-              <w:rPr>
-                <w:rFonts w:ascii="Arial" w:hAnsi="Arial" w:cs="Arial" w:hint="cs"/>
-                <w:rtl/>
-              </w:rPr>
-              <w:t xml:space="preserve">+  ארכיטקטורת קוד </w:t>
-            </w:r>
-            <w:r>
-              <w:rPr>
-                <w:rFonts w:ascii="Arial" w:hAnsi="Arial" w:cs="Arial" w:hint="cs"/>
-                <w:rtl/>
-              </w:rPr>
-              <w:t>(3)</w:t>
+                <w:rFonts w:ascii="Arial" w:hAnsi="Arial" w:cs="Arial" w:hint="cs"/>
+                <w:rtl/>
+              </w:rPr>
+              <w:t xml:space="preserve">רכיבים דרמטיים בעזרת מנוע </w:t>
+            </w:r>
+            <w:proofErr w:type="spellStart"/>
+            <w:r>
+              <w:rPr>
+                <w:rFonts w:ascii="Arial" w:hAnsi="Arial" w:cs="Arial" w:hint="cs"/>
+                <w:rtl/>
+              </w:rPr>
+              <w:t>טוויין</w:t>
+            </w:r>
+            <w:proofErr w:type="spellEnd"/>
+            <w:r>
+              <w:rPr>
+                <w:rFonts w:ascii="Arial" w:hAnsi="Arial" w:cs="Arial" w:hint="cs"/>
+                <w:rtl/>
+              </w:rPr>
+              <w:t xml:space="preserve"> (3)</w:t>
             </w:r>
           </w:p>
         </w:tc>
@@ -2927,41 +3322,21 @@
                 <w:rFonts w:ascii="Arial" w:hAnsi="Arial" w:cs="Arial" w:hint="cs"/>
                 <w:rtl/>
               </w:rPr>
-              <w:t>מימוש תהלי</w:t>
-            </w:r>
-            <w:r>
-              <w:rPr>
-                <w:rFonts w:ascii="Arial" w:hAnsi="Arial" w:cs="Arial" w:hint="cs"/>
-                <w:rtl/>
-              </w:rPr>
-              <w:t>כי</w:t>
-            </w:r>
-            <w:r>
-              <w:rPr>
-                <w:rFonts w:ascii="Arial" w:hAnsi="Arial" w:cs="Arial" w:hint="cs"/>
-                <w:rtl/>
-              </w:rPr>
-              <w:t xml:space="preserve"> הליבה</w:t>
-            </w:r>
-            <w:r>
-              <w:rPr>
-                <w:rFonts w:ascii="Arial" w:hAnsi="Arial" w:cs="Arial" w:hint="cs"/>
-                <w:rtl/>
-              </w:rPr>
-              <w:t xml:space="preserve"> +</w:t>
-            </w:r>
-            <w:r>
-              <w:rPr>
-                <w:rFonts w:ascii="Arial" w:hAnsi="Arial" w:cs="Arial"/>
-              </w:rPr>
-              <w:t xml:space="preserve"> </w:t>
-            </w:r>
-            <w:r>
-              <w:rPr>
-                <w:rFonts w:ascii="Arial" w:hAnsi="Arial" w:cs="Arial" w:hint="cs"/>
-                <w:rtl/>
-              </w:rPr>
-              <w:t>ארכיטקטורת קוד (3)</w:t>
+              <w:t xml:space="preserve">בחירה, </w:t>
+            </w:r>
+            <w:r>
+              <w:rPr>
+                <w:rFonts w:ascii="Arial" w:hAnsi="Arial" w:cs="Arial"/>
+                <w:rtl/>
+              </w:rPr>
+              <w:t>רכיבים דרמטיים</w:t>
+            </w:r>
+            <w:r>
+              <w:rPr>
+                <w:rFonts w:ascii="Arial" w:hAnsi="Arial" w:cs="Arial" w:hint="cs"/>
+                <w:rtl/>
+              </w:rPr>
+              <w:t xml:space="preserve"> (3)</w:t>
             </w:r>
           </w:p>
         </w:tc>
@@ -2995,135 +3370,45 @@
               <w:suppressAutoHyphens w:val="0"/>
               <w:spacing w:before="57" w:after="57"/>
               <w:rPr>
-                <w:rFonts w:ascii="Arial" w:hAnsi="Arial" w:cs="Arial"/>
+                <w:rFonts w:ascii="Arial" w:hAnsi="Arial" w:cs="Arial" w:hint="cs"/>
+                <w:rtl/>
               </w:rPr>
             </w:pPr>
-            <w:r>
-              <w:rPr>
-                <w:rFonts w:ascii="Arial" w:hAnsi="Arial" w:cs="Arial"/>
-                <w:rtl/>
-              </w:rPr>
-              <w:t>עיצוב: רכיבים דרמטיים</w:t>
-            </w:r>
-            <w:r>
-              <w:rPr>
-                <w:rFonts w:ascii="Arial" w:hAnsi="Arial" w:cs="Arial" w:hint="cs"/>
-                <w:rtl/>
-              </w:rPr>
-              <w:t>.</w:t>
-            </w:r>
-          </w:p>
-        </w:tc>
-        <w:tc>
-          <w:tcPr>
-            <w:tcW w:w="2643" w:type="dxa"/>
-            <w:gridSpan w:val="2"/>
-          </w:tcPr>
-          <w:p>
-            <w:pPr>
-              <w:suppressAutoHyphens w:val="0"/>
-              <w:spacing w:before="57" w:after="57"/>
-              <w:rPr>
-                <w:rFonts w:ascii="Arial" w:hAnsi="Arial" w:cs="Arial"/>
-              </w:rPr>
-            </w:pPr>
-            <w:r>
-              <w:rPr>
-                <w:rFonts w:ascii="Arial" w:hAnsi="Arial" w:cs="Arial" w:hint="cs"/>
-                <w:rtl/>
-              </w:rPr>
-              <w:t>רכיבים דרמטיים בעזרת מנוע טוויין (3)</w:t>
-            </w:r>
-          </w:p>
-        </w:tc>
-        <w:tc>
-          <w:tcPr>
-            <w:tcW w:w="2525" w:type="dxa"/>
-          </w:tcPr>
-          <w:p>
-            <w:pPr>
-              <w:suppressAutoHyphens w:val="0"/>
-              <w:spacing w:before="57" w:after="57"/>
-              <w:rPr>
-                <w:rFonts w:ascii="Arial" w:hAnsi="Arial" w:cs="Arial"/>
-              </w:rPr>
-            </w:pPr>
-            <w:r>
-              <w:rPr>
-                <w:rFonts w:ascii="Arial" w:hAnsi="Arial" w:cs="Arial" w:hint="cs"/>
-                <w:rtl/>
-              </w:rPr>
-              <w:t xml:space="preserve">בחירה, </w:t>
-            </w:r>
-            <w:r>
-              <w:rPr>
-                <w:rFonts w:ascii="Arial" w:hAnsi="Arial" w:cs="Arial"/>
-                <w:rtl/>
-              </w:rPr>
-              <w:t>רכיבים דרמטיים</w:t>
-            </w:r>
-            <w:r>
-              <w:rPr>
-                <w:rFonts w:ascii="Arial" w:hAnsi="Arial" w:cs="Arial" w:hint="cs"/>
-                <w:rtl/>
-              </w:rPr>
-              <w:t xml:space="preserve"> (3)</w:t>
-            </w:r>
-          </w:p>
-        </w:tc>
-      </w:tr>
-      <w:tr>
-        <w:tc>
-          <w:tcPr>
-            <w:tcW w:w="2600" w:type="dxa"/>
-          </w:tcPr>
-          <w:p>
-            <w:pPr>
-              <w:pStyle w:val="ListParagraph"/>
-              <w:numPr>
-                <w:ilvl w:val="0"/>
-                <w:numId w:val="8"/>
-              </w:numPr>
-              <w:suppressAutoHyphens w:val="0"/>
-              <w:spacing w:before="57" w:after="57"/>
-              <w:rPr>
-                <w:rFonts w:ascii="Arial" w:hAnsi="Arial" w:cs="Arial"/>
-              </w:rPr>
-            </w:pPr>
-          </w:p>
-        </w:tc>
-        <w:tc>
-          <w:tcPr>
-            <w:tcW w:w="2414" w:type="dxa"/>
-          </w:tcPr>
-          <w:p>
-            <w:pPr>
-              <w:suppressAutoHyphens w:val="0"/>
-              <w:spacing w:before="57" w:after="57"/>
-              <w:rPr>
-                <w:rFonts w:ascii="Arial" w:hAnsi="Arial" w:cs="Arial"/>
-              </w:rPr>
-            </w:pPr>
-            <w:r>
-              <w:rPr>
-                <w:rFonts w:ascii="Arial" w:hAnsi="Arial" w:cs="Arial"/>
-                <w:rtl/>
-              </w:rPr>
-              <w:t>תיכנות: עולם דו-ממדי</w:t>
-            </w:r>
-            <w:r>
-              <w:rPr>
-                <w:rFonts w:ascii="Arial" w:hAnsi="Arial" w:cs="Arial" w:hint="cs"/>
-                <w:rtl/>
-              </w:rPr>
-              <w:t>.</w:t>
-            </w:r>
-            <w:r>
-              <w:rPr>
-                <w:rFonts w:ascii="Arial" w:hAnsi="Arial" w:cs="Arial"/>
-                <w:rtl/>
+            <w:proofErr w:type="spellStart"/>
+            <w:r>
+              <w:rPr>
+                <w:rFonts w:ascii="Arial" w:hAnsi="Arial" w:cs="Arial"/>
+                <w:rtl/>
+              </w:rPr>
+              <w:t>תיכנות</w:t>
+            </w:r>
+            <w:proofErr w:type="spellEnd"/>
+            <w:r>
+              <w:rPr>
+                <w:rFonts w:ascii="Arial" w:hAnsi="Arial" w:cs="Arial"/>
+                <w:rtl/>
+              </w:rPr>
+              <w:t xml:space="preserve">: </w:t>
+            </w:r>
+            <w:r>
+              <w:rPr>
+                <w:rFonts w:ascii="Arial" w:hAnsi="Arial" w:cs="Arial" w:hint="cs"/>
+                <w:rtl/>
+              </w:rPr>
+              <w:t>בניית עולם:</w:t>
+            </w:r>
+            <w:r>
+              <w:rPr>
+                <w:rFonts w:ascii="Arial" w:hAnsi="Arial" w:cs="Arial"/>
               </w:rPr>
               <w:t xml:space="preserve"> </w:t>
+            </w:r>
+            <w:r>
+              <w:rPr>
+                <w:rFonts w:ascii="Arial" w:hAnsi="Arial" w:cs="Arial" w:hint="cs"/>
+                <w:rtl/>
+              </w:rPr>
+              <w:t>עולם דו-ממדי ועולם תלת-ממדי.</w:t>
             </w:r>
           </w:p>
         </w:tc>
@@ -3214,19 +3499,106 @@
                 <w:rtl/>
               </w:rPr>
             </w:pPr>
-            <w:r>
-              <w:rPr>
-                <w:rFonts w:ascii="Arial" w:hAnsi="Arial" w:cs="Arial"/>
-                <w:rtl/>
-              </w:rPr>
-              <w:t xml:space="preserve">תיכנות: עולם </w:t>
-            </w:r>
-            <w:r>
-              <w:rPr>
-                <w:rFonts w:ascii="Arial" w:hAnsi="Arial" w:cs="Arial" w:hint="cs"/>
-                <w:rtl/>
-              </w:rPr>
-              <w:t>תלת-ממדי.</w:t>
+            <w:proofErr w:type="spellStart"/>
+            <w:r>
+              <w:rPr>
+                <w:rFonts w:ascii="Arial" w:hAnsi="Arial" w:cs="Arial" w:hint="cs"/>
+                <w:rtl/>
+              </w:rPr>
+              <w:t>תיכנות+</w:t>
+            </w:r>
+            <w:r>
+              <w:rPr>
+                <w:rFonts w:ascii="Arial" w:hAnsi="Arial" w:cs="Arial" w:hint="cs"/>
+                <w:rtl/>
+              </w:rPr>
+              <w:t>עיצוב</w:t>
+            </w:r>
+            <w:proofErr w:type="spellEnd"/>
+            <w:r>
+              <w:rPr>
+                <w:rFonts w:ascii="Arial" w:hAnsi="Arial" w:cs="Arial" w:hint="cs"/>
+                <w:rtl/>
+              </w:rPr>
+              <w:t xml:space="preserve">: </w:t>
+            </w:r>
+            <w:r>
+              <w:rPr>
+                <w:rFonts w:ascii="Arial" w:hAnsi="Arial" w:cs="Arial" w:hint="cs"/>
+                <w:rtl/>
+              </w:rPr>
+              <w:t>שיפור המשחקיות</w:t>
+            </w:r>
+            <w:r>
+              <w:rPr>
+                <w:rFonts w:ascii="Arial" w:hAnsi="Arial" w:cs="Arial" w:hint="cs"/>
+                <w:rtl/>
+              </w:rPr>
+              <w:t xml:space="preserve"> ע"י חזותיות.</w:t>
+            </w:r>
+          </w:p>
+          <w:p>
+            <w:pPr>
+              <w:suppressAutoHyphens w:val="0"/>
+              <w:spacing w:before="57" w:after="57"/>
+              <w:rPr>
+                <w:rFonts w:ascii="Arial" w:hAnsi="Arial" w:cs="Arial"/>
+                <w:rtl/>
+              </w:rPr>
+            </w:pPr>
+          </w:p>
+          <w:p>
+            <w:pPr>
+              <w:suppressAutoHyphens w:val="0"/>
+              <w:spacing w:before="57" w:after="57"/>
+              <w:rPr>
+                <w:rFonts w:ascii="Arial" w:hAnsi="Arial" w:cs="Arial" w:hint="cs"/>
+                <w:rtl/>
+              </w:rPr>
+            </w:pPr>
+            <w:proofErr w:type="spellStart"/>
+            <w:r>
+              <w:rPr>
+                <w:rFonts w:ascii="Arial" w:hAnsi="Arial" w:cs="Arial" w:hint="cs"/>
+                <w:rtl/>
+              </w:rPr>
+              <w:t>מישחוק</w:t>
+            </w:r>
+            <w:proofErr w:type="spellEnd"/>
+            <w:r>
+              <w:rPr>
+                <w:rFonts w:ascii="Arial" w:hAnsi="Arial" w:cs="Arial" w:hint="cs"/>
+                <w:rtl/>
+              </w:rPr>
+              <w:t xml:space="preserve"> (</w:t>
+            </w:r>
+            <w:r>
+              <w:rPr>
+                <w:rFonts w:ascii="Arial" w:hAnsi="Arial" w:cs="Arial"/>
+              </w:rPr>
+              <w:t>gamification</w:t>
+            </w:r>
+            <w:r>
+              <w:rPr>
+                <w:rFonts w:ascii="Arial" w:hAnsi="Arial" w:cs="Arial" w:hint="cs"/>
+                <w:rtl/>
+              </w:rPr>
+              <w:t>)</w:t>
+            </w:r>
+            <w:r>
+              <w:rPr>
+                <w:rFonts w:ascii="Arial" w:hAnsi="Arial" w:cs="Arial" w:hint="cs"/>
+                <w:rtl/>
+              </w:rPr>
+              <w:t xml:space="preserve">: לתת </w:t>
+            </w:r>
+            <w:r>
+              <w:rPr>
+                <w:rFonts w:ascii="Arial" w:hAnsi="Arial" w:cs="Arial" w:hint="cs"/>
+                <w:rtl/>
+              </w:rPr>
+              <w:lastRenderedPageBreak/>
+              <w:t>תגמול על כל הצלחה.</w:t>
             </w:r>
           </w:p>
         </w:tc>
@@ -3244,20 +3616,6 @@
                 <w:rtl/>
               </w:rPr>
             </w:pPr>
-            <w:r>
-              <w:rPr>
-                <w:rFonts w:ascii="Arial" w:hAnsi="Arial" w:cs="Arial"/>
-                <w:rtl/>
-              </w:rPr>
-              <w:t>אלגוריתמים ובניית עולם</w:t>
-            </w:r>
-            <w:r>
-              <w:rPr>
-                <w:rFonts w:ascii="Arial" w:hAnsi="Arial" w:cs="Arial" w:hint="cs"/>
-                <w:rtl/>
-              </w:rPr>
-              <w:t xml:space="preserve"> תלת ממדי (3)</w:t>
-            </w:r>
           </w:p>
         </w:tc>
         <w:tc>
@@ -3322,7 +3680,7 @@
               <w:suppressAutoHyphens w:val="0"/>
               <w:spacing w:before="57" w:after="57"/>
               <w:rPr>
-                <w:rFonts w:ascii="Arial" w:hAnsi="Arial" w:cs="Arial"/>
+                <w:rFonts w:ascii="Arial" w:hAnsi="Arial" w:cs="Arial" w:hint="cs"/>
                 <w:rtl/>
               </w:rPr>
             </w:pPr>
@@ -3339,36 +3697,6 @@
                 <w:rtl/>
               </w:rPr>
               <w:t>.</w:t>
-            </w:r>
-          </w:p>
-          <w:p>
-            <w:pPr>
-              <w:suppressAutoHyphens w:val="0"/>
-              <w:spacing w:before="57" w:after="57"/>
-              <w:rPr>
-                <w:rFonts w:ascii="Arial" w:hAnsi="Arial" w:cs="Arial"/>
-                <w:rtl/>
-              </w:rPr>
-            </w:pPr>
-            <w:r>
-              <w:rPr>
-                <w:rFonts w:ascii="Arial" w:hAnsi="Arial" w:cs="Arial" w:hint="cs"/>
-                <w:rtl/>
-              </w:rPr>
-              <w:t>תיכנות:</w:t>
-            </w:r>
-            <w:r>
-              <w:rPr>
-                <w:rFonts w:ascii="Arial" w:hAnsi="Arial" w:cs="Arial"/>
-              </w:rPr>
-              <w:t xml:space="preserve"> </w:t>
-            </w:r>
-            <w:r>
-              <w:rPr>
-                <w:rFonts w:ascii="Arial" w:hAnsi="Arial" w:cs="Arial" w:hint="cs"/>
-                <w:rtl/>
-              </w:rPr>
-              <w:t>שמירה בענן.</w:t>
             </w:r>
           </w:p>
         </w:tc>
@@ -3458,12 +3786,21 @@
                 <w:rtl/>
               </w:rPr>
             </w:pPr>
-            <w:r>
-              <w:rPr>
-                <w:rFonts w:ascii="Arial" w:hAnsi="Arial" w:cs="Arial" w:hint="cs"/>
-                <w:rtl/>
-              </w:rPr>
-              <w:t>תיכנות: משחקים מרובי-שחקנים.</w:t>
+            <w:proofErr w:type="spellStart"/>
+            <w:r>
+              <w:rPr>
+                <w:rFonts w:ascii="Arial" w:hAnsi="Arial" w:cs="Arial" w:hint="cs"/>
+                <w:rtl/>
+              </w:rPr>
+              <w:t>תיכנות</w:t>
+            </w:r>
+            <w:proofErr w:type="spellEnd"/>
+            <w:r>
+              <w:rPr>
+                <w:rFonts w:ascii="Arial" w:hAnsi="Arial" w:cs="Arial" w:hint="cs"/>
+                <w:rtl/>
+              </w:rPr>
+              <w:t>: משחקים מרובי-שחקנים.</w:t>
             </w:r>
           </w:p>
         </w:tc>
@@ -3641,12 +3978,21 @@
                 <w:rFonts w:ascii="Arial" w:hAnsi="Arial" w:cs="Arial"/>
               </w:rPr>
             </w:pPr>
-            <w:r>
-              <w:rPr>
-                <w:rFonts w:ascii="Arial" w:hAnsi="Arial" w:cs="Arial" w:hint="cs"/>
-                <w:rtl/>
-              </w:rPr>
-              <w:t>תיכנות:</w:t>
+            <w:proofErr w:type="spellStart"/>
+            <w:r>
+              <w:rPr>
+                <w:rFonts w:ascii="Arial" w:hAnsi="Arial" w:cs="Arial" w:hint="cs"/>
+                <w:rtl/>
+              </w:rPr>
+              <w:t>תיכנות</w:t>
+            </w:r>
+            <w:proofErr w:type="spellEnd"/>
+            <w:r>
+              <w:rPr>
+                <w:rFonts w:ascii="Arial" w:hAnsi="Arial" w:cs="Arial" w:hint="cs"/>
+                <w:rtl/>
+              </w:rPr>
+              <w:t>:</w:t>
             </w:r>
             <w:r>
               <w:rPr>
@@ -3940,10 +4286,34 @@
           <w:b/>
           <w:bCs/>
         </w:rPr>
-        <w:t>Game Design Workshop: A Playcentric Approach to Creating Innovative Games</w:t>
-      </w:r>
-      <w:r>
-        <w:t xml:space="preserve">, Fourth Edition, by Tracy Fullerton,    </w:t>
+        <w:t xml:space="preserve">Game Design Workshop: A </w:t>
+      </w:r>
+      <w:proofErr w:type="spellStart"/>
+      <w:r>
+        <w:rPr>
+          <w:b/>
+          <w:bCs/>
+        </w:rPr>
+        <w:t>Playcentric</w:t>
+      </w:r>
+      <w:proofErr w:type="spellEnd"/>
+      <w:r>
+        <w:rPr>
+          <w:b/>
+          <w:bCs/>
+        </w:rPr>
+        <w:t xml:space="preserve"> Approach to Creating Innovative Games</w:t>
+      </w:r>
+      <w:r>
+        <w:t xml:space="preserve">, Fourth Edition, by Tracy </w:t>
+      </w:r>
+      <w:proofErr w:type="gramStart"/>
+      <w:r>
+        <w:t xml:space="preserve">Fullerton,   </w:t>
+      </w:r>
+      <w:proofErr w:type="gramEnd"/>
+      <w:r>
+        <w:t xml:space="preserve"> </w:t>
       </w:r>
       <w:hyperlink r:id="rId10" w:tgtFrame="_blank">
         <w:r>
@@ -3974,7 +4344,29 @@
           <w:iCs/>
           <w:color w:val="008000"/>
         </w:rPr>
-        <w:t>794.81536 FUL  X  1</w:t>
+        <w:t xml:space="preserve">794.81536 </w:t>
+      </w:r>
+      <w:proofErr w:type="gramStart"/>
+      <w:r>
+        <w:rPr>
+          <w:b/>
+          <w:bCs/>
+          <w:i/>
+          <w:iCs/>
+          <w:color w:val="008000"/>
+        </w:rPr>
+        <w:t>FUL  X</w:t>
+      </w:r>
+      <w:proofErr w:type="gramEnd"/>
+      <w:r>
+        <w:rPr>
+          <w:b/>
+          <w:bCs/>
+          <w:i/>
+          <w:iCs/>
+          <w:color w:val="008000"/>
+        </w:rPr>
+        <w:t xml:space="preserve">  1</w:t>
       </w:r>
     </w:p>
     <w:p>
@@ -3994,10 +4386,22 @@
           <w:b/>
           <w:bCs/>
         </w:rPr>
-        <w:t xml:space="preserve">Introduction to Game Design, Prototyping, and Development: From Concept to Playable Game with Unity and C#,  </w:t>
-      </w:r>
-      <w:r>
-        <w:t xml:space="preserve">2nd Edition, by </w:t>
+        <w:t xml:space="preserve">Introduction to Game Design, Prototyping, and Development: From Concept to Playable Game with Unity and </w:t>
+      </w:r>
+      <w:proofErr w:type="gramStart"/>
+      <w:r>
+        <w:rPr>
+          <w:b/>
+          <w:bCs/>
+        </w:rPr>
+        <w:t xml:space="preserve">C#,  </w:t>
+      </w:r>
+      <w:r>
+        <w:t>2</w:t>
+      </w:r>
+      <w:proofErr w:type="gramEnd"/>
+      <w:r>
+        <w:t xml:space="preserve">nd Edition, by </w:t>
       </w:r>
       <w:r>
         <w:rPr>
@@ -4086,7 +4490,23 @@
           <w:b/>
           <w:bCs/>
         </w:rPr>
-        <w:t>The Art of Game Design: a Book of Lenses</w:t>
+        <w:t xml:space="preserve">The Art of Game Design: </w:t>
+      </w:r>
+      <w:proofErr w:type="gramStart"/>
+      <w:r>
+        <w:rPr>
+          <w:b/>
+          <w:bCs/>
+        </w:rPr>
+        <w:t>a</w:t>
+      </w:r>
+      <w:proofErr w:type="gramEnd"/>
+      <w:r>
+        <w:rPr>
+          <w:b/>
+          <w:bCs/>
+        </w:rPr>
+        <w:t xml:space="preserve"> Book of Lenses</w:t>
       </w:r>
       <w:r>
         <w:t xml:space="preserve"> </w:t>
@@ -4175,6 +4595,7 @@
         </w:rPr>
         <w:t xml:space="preserve"> </w:t>
       </w:r>
+      <w:proofErr w:type="gramStart"/>
       <w:r>
         <w:rPr>
           <w:b/>
@@ -4183,7 +4604,18 @@
           <w:iCs/>
           <w:color w:val="008000"/>
         </w:rPr>
-        <w:t>NYS  X  1</w:t>
+        <w:t>NYS  X</w:t>
+      </w:r>
+      <w:proofErr w:type="gramEnd"/>
+      <w:r>
+        <w:rPr>
+          <w:b/>
+          <w:bCs/>
+          <w:i/>
+          <w:iCs/>
+          <w:color w:val="008000"/>
+        </w:rPr>
+        <w:t xml:space="preserve">  1</w:t>
       </w:r>
     </w:p>
     <w:p>
@@ -4204,7 +4636,23 @@
           <w:b/>
           <w:bCs/>
         </w:rPr>
-        <w:t xml:space="preserve">Procedural Generation in Game Design, by Tanya X. Short  and Tarn Adams (2018)     </w:t>
+        <w:t xml:space="preserve">Procedural Generation in Game Design, by Tanya X. </w:t>
+      </w:r>
+      <w:proofErr w:type="gramStart"/>
+      <w:r>
+        <w:rPr>
+          <w:b/>
+          <w:bCs/>
+        </w:rPr>
+        <w:t>Short  and</w:t>
+      </w:r>
+      <w:proofErr w:type="gramEnd"/>
+      <w:r>
+        <w:rPr>
+          <w:b/>
+          <w:bCs/>
+        </w:rPr>
+        <w:t xml:space="preserve"> Tarn Adams (2018)     </w:t>
       </w:r>
       <w:hyperlink r:id="rId13">
         <w:r>
@@ -4235,7 +4683,29 @@
           <w:iCs/>
           <w:color w:val="008000"/>
         </w:rPr>
-        <w:t>794.81536 SHO  X  1</w:t>
+        <w:t xml:space="preserve">794.81536 </w:t>
+      </w:r>
+      <w:proofErr w:type="gramStart"/>
+      <w:r>
+        <w:rPr>
+          <w:b/>
+          <w:bCs/>
+          <w:i/>
+          <w:iCs/>
+          <w:color w:val="008000"/>
+        </w:rPr>
+        <w:t>SHO  X</w:t>
+      </w:r>
+      <w:proofErr w:type="gramEnd"/>
+      <w:r>
+        <w:rPr>
+          <w:b/>
+          <w:bCs/>
+          <w:i/>
+          <w:iCs/>
+          <w:color w:val="008000"/>
+        </w:rPr>
+        <w:t xml:space="preserve">  1</w:t>
       </w:r>
     </w:p>
     <w:p>
@@ -4258,7 +4728,23 @@
           <w:b/>
           <w:bCs/>
         </w:rPr>
-        <w:t xml:space="preserve">Procedural Storytelling in Game Design, by Tanya X. Short  and Tarn Adams (2019)  </w:t>
+        <w:t xml:space="preserve">Procedural Storytelling in Game Design, by Tanya X. </w:t>
+      </w:r>
+      <w:proofErr w:type="gramStart"/>
+      <w:r>
+        <w:rPr>
+          <w:b/>
+          <w:bCs/>
+        </w:rPr>
+        <w:t>Short  and</w:t>
+      </w:r>
+      <w:proofErr w:type="gramEnd"/>
+      <w:r>
+        <w:rPr>
+          <w:b/>
+          <w:bCs/>
+        </w:rPr>
+        <w:t xml:space="preserve"> Tarn Adams (2019)  </w:t>
       </w:r>
       <w:hyperlink r:id="rId14">
         <w:r>
@@ -4289,7 +4775,29 @@
           <w:iCs/>
           <w:color w:val="008000"/>
         </w:rPr>
-        <w:t>794.81536 SHO  X  1</w:t>
+        <w:t xml:space="preserve">794.81536 </w:t>
+      </w:r>
+      <w:proofErr w:type="gramStart"/>
+      <w:r>
+        <w:rPr>
+          <w:b/>
+          <w:bCs/>
+          <w:i/>
+          <w:iCs/>
+          <w:color w:val="008000"/>
+        </w:rPr>
+        <w:t>SHO  X</w:t>
+      </w:r>
+      <w:proofErr w:type="gramEnd"/>
+      <w:r>
+        <w:rPr>
+          <w:b/>
+          <w:bCs/>
+          <w:i/>
+          <w:iCs/>
+          <w:color w:val="008000"/>
+        </w:rPr>
+        <w:t xml:space="preserve">  1</w:t>
       </w:r>
     </w:p>
     <w:p>
@@ -4386,7 +4894,14 @@
         <w:rPr>
           <w:rStyle w:val="StrongEmphasis"/>
         </w:rPr>
-        <w:t>. Level Up! The Guide to Great Video Game Design</w:t>
+        <w:t xml:space="preserve">. Level Up! The Guide to Great Video Game </w:t>
+      </w:r>
+      <w:proofErr w:type="gramStart"/>
+      <w:r>
+        <w:rPr>
+          <w:rStyle w:val="StrongEmphasis"/>
+        </w:rPr>
+        <w:t>Design</w:t>
       </w:r>
       <w:bookmarkEnd w:id="2"/>
       <w:r>
@@ -4399,7 +4914,14 @@
         <w:rPr>
           <w:rStyle w:val="Hyperlink"/>
         </w:rPr>
-        <w:t>by Scott Rogers,</w:t>
+        <w:t>by</w:t>
+      </w:r>
+      <w:proofErr w:type="gramEnd"/>
+      <w:r>
+        <w:rPr>
+          <w:rStyle w:val="Hyperlink"/>
+        </w:rPr>
+        <w:t xml:space="preserve"> Scott Rogers,</w:t>
       </w:r>
     </w:p>
     <w:p>
@@ -4471,7 +4993,7 @@
 </file>
 
 <file path=word/endnotes.xml><?xml version="1.0" encoding="utf-8"?>
-<w:endnotes xmlns:wpc="http://schemas.microsoft.com/office/word/2010/wordprocessingCanvas" xmlns:cx="http://schemas.microsoft.com/office/drawing/2014/chartex" xmlns:cx1="http://schemas.microsoft.com/office/drawing/2015/9/8/chartex" xmlns:cx2="http://schemas.microsoft.com/office/drawing/2015/10/21/chartex" xmlns:cx3="http://schemas.microsoft.com/office/drawing/2016/5/9/chartex" xmlns:cx4="http://schemas.microsoft.com/office/drawing/2016/5/10/chartex" xmlns:cx5="http://schemas.microsoft.com/office/drawing/2016/5/11/chartex" xmlns:cx6="http://schemas.microsoft.com/office/drawing/2016/5/12/chartex" xmlns:cx7="http://schemas.microsoft.com/office/drawing/2016/5/13/chartex" xmlns:cx8="http://schemas.microsoft.com/office/drawing/2016/5/14/chartex" xmlns:mc="http://schemas.openxmlformats.org/markup-compatibility/2006" xmlns:aink="http://schemas.microsoft.com/office/drawing/2016/ink" xmlns:am3d="http://schemas.microsoft.com/office/drawing/2017/model3d" xmlns:o="urn:schemas-microsoft-com:office:office" xmlns:oel="http://schemas.microsoft.com/office/2019/extlst" xmlns:r="http://schemas.openxmlformats.org/officeDocument/2006/relationships" xmlns:m="http://schemas.openxmlformats.org/officeDocument/2006/math" xmlns:v="urn:schemas-microsoft-com:vml" xmlns:wp14="http://schemas.microsoft.com/office/word/2010/wordprocessingDrawing" xmlns:wp="http://schemas.openxmlformats.org/drawingml/2006/wordprocessingDrawing" xmlns:w10="urn:schemas-microsoft-com:office:word" xmlns:w="http://schemas.openxmlformats.org/wordprocessingml/2006/main" xmlns:w14="http://schemas.microsoft.com/office/word/2010/wordml" xmlns:w15="http://schemas.microsoft.com/office/word/2012/wordml" xmlns:w16cei="http://schemas.microsoft.com/office/word/2026/wordml/cei" xmlns:w16cex="http://schemas.microsoft.com/office/word/2018/wordml/cex" xmlns:w16cid="http://schemas.microsoft.com/office/word/2016/wordml/cid" xmlns:w16="http://schemas.microsoft.com/office/word/2018/wordml" xmlns:w16du="http://schemas.microsoft.com/office/word/2023/wordml/word16du" xmlns:w16sdtdh="http://schemas.microsoft.com/office/word/2020/wordml/sdtdatahash" xmlns:w16sdtfl="http://schemas.microsoft.com/office/word/2024/wordml/sdtformatlock" xmlns:w16se="http://schemas.microsoft.com/office/word/2015/wordml/symex" xmlns:wpg="http://schemas.microsoft.com/office/word/2010/wordprocessingGroup" xmlns:wpi="http://schemas.microsoft.com/office/word/2010/wordprocessingInk" xmlns:wne="http://schemas.microsoft.com/office/word/2006/wordml" xmlns:wps="http://schemas.microsoft.com/office/word/2010/wordprocessingShape" mc:Ignorable="w14 w15 w16se w16cid w16 w16cex w16sdtdh w16sdtfl w16du wp14">
+<w:endnotes xmlns:wpc="http://schemas.microsoft.com/office/word/2010/wordprocessingCanvas" xmlns:cx="http://schemas.microsoft.com/office/drawing/2014/chartex" xmlns:cx1="http://schemas.microsoft.com/office/drawing/2015/9/8/chartex" xmlns:cx2="http://schemas.microsoft.com/office/drawing/2015/10/21/chartex" xmlns:cx3="http://schemas.microsoft.com/office/drawing/2016/5/9/chartex" xmlns:cx4="http://schemas.microsoft.com/office/drawing/2016/5/10/chartex" xmlns:cx5="http://schemas.microsoft.com/office/drawing/2016/5/11/chartex" xmlns:cx6="http://schemas.microsoft.com/office/drawing/2016/5/12/chartex" xmlns:cx7="http://schemas.microsoft.com/office/drawing/2016/5/13/chartex" xmlns:cx8="http://schemas.microsoft.com/office/drawing/2016/5/14/chartex" xmlns:mc="http://schemas.openxmlformats.org/markup-compatibility/2006" xmlns:aink="http://schemas.microsoft.com/office/drawing/2016/ink" xmlns:am3d="http://schemas.microsoft.com/office/drawing/2017/model3d" xmlns:o="urn:schemas-microsoft-com:office:office" xmlns:oel="http://schemas.microsoft.com/office/2019/extlst" xmlns:r="http://schemas.openxmlformats.org/officeDocument/2006/relationships" xmlns:m="http://schemas.openxmlformats.org/officeDocument/2006/math" xmlns:v="urn:schemas-microsoft-com:vml" xmlns:wp14="http://schemas.microsoft.com/office/word/2010/wordprocessingDrawing" xmlns:wp="http://schemas.openxmlformats.org/drawingml/2006/wordprocessingDrawing" xmlns:w10="urn:schemas-microsoft-com:office:word" xmlns:w="http://schemas.openxmlformats.org/wordprocessingml/2006/main" xmlns:w14="http://schemas.microsoft.com/office/word/2010/wordml" xmlns:w15="http://schemas.microsoft.com/office/word/2012/wordml" xmlns:w16cex="http://schemas.microsoft.com/office/word/2018/wordml/cex" xmlns:w16cid="http://schemas.microsoft.com/office/word/2016/wordml/cid" xmlns:w16="http://schemas.microsoft.com/office/word/2018/wordml" xmlns:w16du="http://schemas.microsoft.com/office/word/2023/wordml/word16du" xmlns:w16sdtdh="http://schemas.microsoft.com/office/word/2020/wordml/sdtdatahash" xmlns:w16sdtfl="http://schemas.microsoft.com/office/word/2024/wordml/sdtformatlock" xmlns:w16se="http://schemas.microsoft.com/office/word/2015/wordml/symex" xmlns:wpg="http://schemas.microsoft.com/office/word/2010/wordprocessingGroup" xmlns:wpi="http://schemas.microsoft.com/office/word/2010/wordprocessingInk" xmlns:wne="http://schemas.microsoft.com/office/word/2006/wordml" xmlns:wps="http://schemas.microsoft.com/office/word/2010/wordprocessingShape" mc:Ignorable="w14 w15 w16se w16cid w16 w16cex w16sdtdh w16sdtfl w16du wp14">
   <w:endnote w:type="separator" w:id="-1">
     <w:p>
       <w:r>
@@ -4490,7 +5012,7 @@
 </file>
 
 <file path=word/footnotes.xml><?xml version="1.0" encoding="utf-8"?>
-<w:footnotes xmlns:wpc="http://schemas.microsoft.com/office/word/2010/wordprocessingCanvas" xmlns:cx="http://schemas.microsoft.com/office/drawing/2014/chartex" xmlns:cx1="http://schemas.microsoft.com/office/drawing/2015/9/8/chartex" xmlns:cx2="http://schemas.microsoft.com/office/drawing/2015/10/21/chartex" xmlns:cx3="http://schemas.microsoft.com/office/drawing/2016/5/9/chartex" xmlns:cx4="http://schemas.microsoft.com/office/drawing/2016/5/10/chartex" xmlns:cx5="http://schemas.microsoft.com/office/drawing/2016/5/11/chartex" xmlns:cx6="http://schemas.microsoft.com/office/drawing/2016/5/12/chartex" xmlns:cx7="http://schemas.microsoft.com/office/drawing/2016/5/13/chartex" xmlns:cx8="http://schemas.microsoft.com/office/drawing/2016/5/14/chartex" xmlns:mc="http://schemas.openxmlformats.org/markup-compatibility/2006" xmlns:aink="http://schemas.microsoft.com/office/drawing/2016/ink" xmlns:am3d="http://schemas.microsoft.com/office/drawing/2017/model3d" xmlns:o="urn:schemas-microsoft-com:office:office" xmlns:oel="http://schemas.microsoft.com/office/2019/extlst" xmlns:r="http://schemas.openxmlformats.org/officeDocument/2006/relationships" xmlns:m="http://schemas.openxmlformats.org/officeDocument/2006/math" xmlns:v="urn:schemas-microsoft-com:vml" xmlns:wp14="http://schemas.microsoft.com/office/word/2010/wordprocessingDrawing" xmlns:wp="http://schemas.openxmlformats.org/drawingml/2006/wordprocessingDrawing" xmlns:w10="urn:schemas-microsoft-com:office:word" xmlns:w="http://schemas.openxmlformats.org/wordprocessingml/2006/main" xmlns:w14="http://schemas.microsoft.com/office/word/2010/wordml" xmlns:w15="http://schemas.microsoft.com/office/word/2012/wordml" xmlns:w16cei="http://schemas.microsoft.com/office/word/2026/wordml/cei" xmlns:w16cex="http://schemas.microsoft.com/office/word/2018/wordml/cex" xmlns:w16cid="http://schemas.microsoft.com/office/word/2016/wordml/cid" xmlns:w16="http://schemas.microsoft.com/office/word/2018/wordml" xmlns:w16du="http://schemas.microsoft.com/office/word/2023/wordml/word16du" xmlns:w16sdtdh="http://schemas.microsoft.com/office/word/2020/wordml/sdtdatahash" xmlns:w16sdtfl="http://schemas.microsoft.com/office/word/2024/wordml/sdtformatlock" xmlns:w16se="http://schemas.microsoft.com/office/word/2015/wordml/symex" xmlns:wpg="http://schemas.microsoft.com/office/word/2010/wordprocessingGroup" xmlns:wpi="http://schemas.microsoft.com/office/word/2010/wordprocessingInk" xmlns:wne="http://schemas.microsoft.com/office/word/2006/wordml" xmlns:wps="http://schemas.microsoft.com/office/word/2010/wordprocessingShape" mc:Ignorable="w14 w15 w16se w16cid w16 w16cex w16sdtdh w16sdtfl w16du wp14">
+<w:footnotes xmlns:wpc="http://schemas.microsoft.com/office/word/2010/wordprocessingCanvas" xmlns:cx="http://schemas.microsoft.com/office/drawing/2014/chartex" xmlns:cx1="http://schemas.microsoft.com/office/drawing/2015/9/8/chartex" xmlns:cx2="http://schemas.microsoft.com/office/drawing/2015/10/21/chartex" xmlns:cx3="http://schemas.microsoft.com/office/drawing/2016/5/9/chartex" xmlns:cx4="http://schemas.microsoft.com/office/drawing/2016/5/10/chartex" xmlns:cx5="http://schemas.microsoft.com/office/drawing/2016/5/11/chartex" xmlns:cx6="http://schemas.microsoft.com/office/drawing/2016/5/12/chartex" xmlns:cx7="http://schemas.microsoft.com/office/drawing/2016/5/13/chartex" xmlns:cx8="http://schemas.microsoft.com/office/drawing/2016/5/14/chartex" xmlns:mc="http://schemas.openxmlformats.org/markup-compatibility/2006" xmlns:aink="http://schemas.microsoft.com/office/drawing/2016/ink" xmlns:am3d="http://schemas.microsoft.com/office/drawing/2017/model3d" xmlns:o="urn:schemas-microsoft-com:office:office" xmlns:oel="http://schemas.microsoft.com/office/2019/extlst" xmlns:r="http://schemas.openxmlformats.org/officeDocument/2006/relationships" xmlns:m="http://schemas.openxmlformats.org/officeDocument/2006/math" xmlns:v="urn:schemas-microsoft-com:vml" xmlns:wp14="http://schemas.microsoft.com/office/word/2010/wordprocessingDrawing" xmlns:wp="http://schemas.openxmlformats.org/drawingml/2006/wordprocessingDrawing" xmlns:w10="urn:schemas-microsoft-com:office:word" xmlns:w="http://schemas.openxmlformats.org/wordprocessingml/2006/main" xmlns:w14="http://schemas.microsoft.com/office/word/2010/wordml" xmlns:w15="http://schemas.microsoft.com/office/word/2012/wordml" xmlns:w16cex="http://schemas.microsoft.com/office/word/2018/wordml/cex" xmlns:w16cid="http://schemas.microsoft.com/office/word/2016/wordml/cid" xmlns:w16="http://schemas.microsoft.com/office/word/2018/wordml" xmlns:w16du="http://schemas.microsoft.com/office/word/2023/wordml/word16du" xmlns:w16sdtdh="http://schemas.microsoft.com/office/word/2020/wordml/sdtdatahash" xmlns:w16sdtfl="http://schemas.microsoft.com/office/word/2024/wordml/sdtformatlock" xmlns:w16se="http://schemas.microsoft.com/office/word/2015/wordml/symex" xmlns:wpg="http://schemas.microsoft.com/office/word/2010/wordprocessingGroup" xmlns:wpi="http://schemas.microsoft.com/office/word/2010/wordprocessingInk" xmlns:wne="http://schemas.microsoft.com/office/word/2006/wordml" xmlns:wps="http://schemas.microsoft.com/office/word/2010/wordprocessingShape" mc:Ignorable="w14 w15 w16se w16cid w16 w16cex w16sdtdh w16sdtfl w16du wp14">
   <w:footnote w:type="separator" w:id="-1">
     <w:p>
       <w:r>
@@ -4509,7 +5031,7 @@
 </file>
 
 <file path=word/header1.xml><?xml version="1.0" encoding="utf-8"?>
-<w:hdr xmlns:wpc="http://schemas.microsoft.com/office/word/2010/wordprocessingCanvas" xmlns:cx="http://schemas.microsoft.com/office/drawing/2014/chartex" xmlns:cx1="http://schemas.microsoft.com/office/drawing/2015/9/8/chartex" xmlns:cx2="http://schemas.microsoft.com/office/drawing/2015/10/21/chartex" xmlns:cx3="http://schemas.microsoft.com/office/drawing/2016/5/9/chartex" xmlns:cx4="http://schemas.microsoft.com/office/drawing/2016/5/10/chartex" xmlns:cx5="http://schemas.microsoft.com/office/drawing/2016/5/11/chartex" xmlns:cx6="http://schemas.microsoft.com/office/drawing/2016/5/12/chartex" xmlns:cx7="http://schemas.microsoft.com/office/drawing/2016/5/13/chartex" xmlns:cx8="http://schemas.microsoft.com/office/drawing/2016/5/14/chartex" xmlns:mc="http://schemas.openxmlformats.org/markup-compatibility/2006" xmlns:aink="http://schemas.microsoft.com/office/drawing/2016/ink" xmlns:am3d="http://schemas.microsoft.com/office/drawing/2017/model3d" xmlns:o="urn:schemas-microsoft-com:office:office" xmlns:oel="http://schemas.microsoft.com/office/2019/extlst" xmlns:r="http://schemas.openxmlformats.org/officeDocument/2006/relationships" xmlns:m="http://schemas.openxmlformats.org/officeDocument/2006/math" xmlns:v="urn:schemas-microsoft-com:vml" xmlns:wp14="http://schemas.microsoft.com/office/word/2010/wordprocessingDrawing" xmlns:wp="http://schemas.openxmlformats.org/drawingml/2006/wordprocessingDrawing" xmlns:w10="urn:schemas-microsoft-com:office:word" xmlns:w="http://schemas.openxmlformats.org/wordprocessingml/2006/main" xmlns:w14="http://schemas.microsoft.com/office/word/2010/wordml" xmlns:w15="http://schemas.microsoft.com/office/word/2012/wordml" xmlns:w16cei="http://schemas.microsoft.com/office/word/2026/wordml/cei" xmlns:w16cex="http://schemas.microsoft.com/office/word/2018/wordml/cex" xmlns:w16cid="http://schemas.microsoft.com/office/word/2016/wordml/cid" xmlns:w16="http://schemas.microsoft.com/office/word/2018/wordml" xmlns:w16du="http://schemas.microsoft.com/office/word/2023/wordml/word16du" xmlns:w16sdtdh="http://schemas.microsoft.com/office/word/2020/wordml/sdtdatahash" xmlns:w16sdtfl="http://schemas.microsoft.com/office/word/2024/wordml/sdtformatlock" xmlns:w16se="http://schemas.microsoft.com/office/word/2015/wordml/symex" xmlns:wpg="http://schemas.microsoft.com/office/word/2010/wordprocessingGroup" xmlns:wpi="http://schemas.microsoft.com/office/word/2010/wordprocessingInk" xmlns:wne="http://schemas.microsoft.com/office/word/2006/wordml" xmlns:wps="http://schemas.microsoft.com/office/word/2010/wordprocessingShape" mc:Ignorable="w14 w15 w16se w16cid w16 w16cex w16sdtdh w16sdtfl w16du wp14">
+<w:hdr xmlns:wpc="http://schemas.microsoft.com/office/word/2010/wordprocessingCanvas" xmlns:cx="http://schemas.microsoft.com/office/drawing/2014/chartex" xmlns:cx1="http://schemas.microsoft.com/office/drawing/2015/9/8/chartex" xmlns:cx2="http://schemas.microsoft.com/office/drawing/2015/10/21/chartex" xmlns:cx3="http://schemas.microsoft.com/office/drawing/2016/5/9/chartex" xmlns:cx4="http://schemas.microsoft.com/office/drawing/2016/5/10/chartex" xmlns:cx5="http://schemas.microsoft.com/office/drawing/2016/5/11/chartex" xmlns:cx6="http://schemas.microsoft.com/office/drawing/2016/5/12/chartex" xmlns:cx7="http://schemas.microsoft.com/office/drawing/2016/5/13/chartex" xmlns:cx8="http://schemas.microsoft.com/office/drawing/2016/5/14/chartex" xmlns:mc="http://schemas.openxmlformats.org/markup-compatibility/2006" xmlns:aink="http://schemas.microsoft.com/office/drawing/2016/ink" xmlns:am3d="http://schemas.microsoft.com/office/drawing/2017/model3d" xmlns:o="urn:schemas-microsoft-com:office:office" xmlns:oel="http://schemas.microsoft.com/office/2019/extlst" xmlns:r="http://schemas.openxmlformats.org/officeDocument/2006/relationships" xmlns:m="http://schemas.openxmlformats.org/officeDocument/2006/math" xmlns:v="urn:schemas-microsoft-com:vml" xmlns:wp14="http://schemas.microsoft.com/office/word/2010/wordprocessingDrawing" xmlns:wp="http://schemas.openxmlformats.org/drawingml/2006/wordprocessingDrawing" xmlns:w10="urn:schemas-microsoft-com:office:word" xmlns:w="http://schemas.openxmlformats.org/wordprocessingml/2006/main" xmlns:w14="http://schemas.microsoft.com/office/word/2010/wordml" xmlns:w15="http://schemas.microsoft.com/office/word/2012/wordml" xmlns:w16cex="http://schemas.microsoft.com/office/word/2018/wordml/cex" xmlns:w16cid="http://schemas.microsoft.com/office/word/2016/wordml/cid" xmlns:w16="http://schemas.microsoft.com/office/word/2018/wordml" xmlns:w16du="http://schemas.microsoft.com/office/word/2023/wordml/word16du" xmlns:w16sdtdh="http://schemas.microsoft.com/office/word/2020/wordml/sdtdatahash" xmlns:w16sdtfl="http://schemas.microsoft.com/office/word/2024/wordml/sdtformatlock" xmlns:w16se="http://schemas.microsoft.com/office/word/2015/wordml/symex" xmlns:wpg="http://schemas.microsoft.com/office/word/2010/wordprocessingGroup" xmlns:wpi="http://schemas.microsoft.com/office/word/2010/wordprocessingInk" xmlns:wne="http://schemas.microsoft.com/office/word/2006/wordml" xmlns:wps="http://schemas.microsoft.com/office/word/2010/wordprocessingShape" mc:Ignorable="w14 w15 w16se w16cid w16 w16cex w16sdtdh w16sdtfl w16du wp14">
   <w:p>
     <w:pPr>
       <w:pStyle w:val="Header"/>
@@ -4531,7 +5053,7 @@
 </file>
 
 <file path=word/numbering.xml><?xml version="1.0" encoding="utf-8"?>
-<w:numbering xmlns:wpc="http://schemas.microsoft.com/office/word/2010/wordprocessingCanvas" xmlns:cx="http://schemas.microsoft.com/office/drawing/2014/chartex" xmlns:cx1="http://schemas.microsoft.com/office/drawing/2015/9/8/chartex" xmlns:cx2="http://schemas.microsoft.com/office/drawing/2015/10/21/chartex" xmlns:cx3="http://schemas.microsoft.com/office/drawing/2016/5/9/chartex" xmlns:cx4="http://schemas.microsoft.com/office/drawing/2016/5/10/chartex" xmlns:cx5="http://schemas.microsoft.com/office/drawing/2016/5/11/chartex" xmlns:cx6="http://schemas.microsoft.com/office/drawing/2016/5/12/chartex" xmlns:cx7="http://schemas.microsoft.com/office/drawing/2016/5/13/chartex" xmlns:cx8="http://schemas.microsoft.com/office/drawing/2016/5/14/chartex" xmlns:mc="http://schemas.openxmlformats.org/markup-compatibility/2006" xmlns:aink="http://schemas.microsoft.com/office/drawing/2016/ink" xmlns:am3d="http://schemas.microsoft.com/office/drawing/2017/model3d" xmlns:o="urn:schemas-microsoft-com:office:office" xmlns:oel="http://schemas.microsoft.com/office/2019/extlst" xmlns:r="http://schemas.openxmlformats.org/officeDocument/2006/relationships" xmlns:m="http://schemas.openxmlformats.org/officeDocument/2006/math" xmlns:v="urn:schemas-microsoft-com:vml" xmlns:wp14="http://schemas.microsoft.com/office/word/2010/wordprocessingDrawing" xmlns:wp="http://schemas.openxmlformats.org/drawingml/2006/wordprocessingDrawing" xmlns:w10="urn:schemas-microsoft-com:office:word" xmlns:w="http://schemas.openxmlformats.org/wordprocessingml/2006/main" xmlns:w14="http://schemas.microsoft.com/office/word/2010/wordml" xmlns:w15="http://schemas.microsoft.com/office/word/2012/wordml" xmlns:w16cei="http://schemas.microsoft.com/office/word/2026/wordml/cei" xmlns:w16cex="http://schemas.microsoft.com/office/word/2018/wordml/cex" xmlns:w16cid="http://schemas.microsoft.com/office/word/2016/wordml/cid" xmlns:w16="http://schemas.microsoft.com/office/word/2018/wordml" xmlns:w16du="http://schemas.microsoft.com/office/word/2023/wordml/word16du" xmlns:w16sdtdh="http://schemas.microsoft.com/office/word/2020/wordml/sdtdatahash" xmlns:w16sdtfl="http://schemas.microsoft.com/office/word/2024/wordml/sdtformatlock" xmlns:w16se="http://schemas.microsoft.com/office/word/2015/wordml/symex" xmlns:wpg="http://schemas.microsoft.com/office/word/2010/wordprocessingGroup" xmlns:wpi="http://schemas.microsoft.com/office/word/2010/wordprocessingInk" xmlns:wne="http://schemas.microsoft.com/office/word/2006/wordml" xmlns:wps="http://schemas.microsoft.com/office/word/2010/wordprocessingShape" mc:Ignorable="w14 w15 w16se w16cid w16 w16cex w16sdtdh w16sdtfl w16du wp14">
+<w:numbering xmlns:wpc="http://schemas.microsoft.com/office/word/2010/wordprocessingCanvas" xmlns:cx="http://schemas.microsoft.com/office/drawing/2014/chartex" xmlns:cx1="http://schemas.microsoft.com/office/drawing/2015/9/8/chartex" xmlns:cx2="http://schemas.microsoft.com/office/drawing/2015/10/21/chartex" xmlns:cx3="http://schemas.microsoft.com/office/drawing/2016/5/9/chartex" xmlns:cx4="http://schemas.microsoft.com/office/drawing/2016/5/10/chartex" xmlns:cx5="http://schemas.microsoft.com/office/drawing/2016/5/11/chartex" xmlns:cx6="http://schemas.microsoft.com/office/drawing/2016/5/12/chartex" xmlns:cx7="http://schemas.microsoft.com/office/drawing/2016/5/13/chartex" xmlns:cx8="http://schemas.microsoft.com/office/drawing/2016/5/14/chartex" xmlns:mc="http://schemas.openxmlformats.org/markup-compatibility/2006" xmlns:aink="http://schemas.microsoft.com/office/drawing/2016/ink" xmlns:am3d="http://schemas.microsoft.com/office/drawing/2017/model3d" xmlns:o="urn:schemas-microsoft-com:office:office" xmlns:oel="http://schemas.microsoft.com/office/2019/extlst" xmlns:r="http://schemas.openxmlformats.org/officeDocument/2006/relationships" xmlns:m="http://schemas.openxmlformats.org/officeDocument/2006/math" xmlns:v="urn:schemas-microsoft-com:vml" xmlns:wp14="http://schemas.microsoft.com/office/word/2010/wordprocessingDrawing" xmlns:wp="http://schemas.openxmlformats.org/drawingml/2006/wordprocessingDrawing" xmlns:w10="urn:schemas-microsoft-com:office:word" xmlns:w="http://schemas.openxmlformats.org/wordprocessingml/2006/main" xmlns:w14="http://schemas.microsoft.com/office/word/2010/wordml" xmlns:w15="http://schemas.microsoft.com/office/word/2012/wordml" xmlns:w16cex="http://schemas.microsoft.com/office/word/2018/wordml/cex" xmlns:w16cid="http://schemas.microsoft.com/office/word/2016/wordml/cid" xmlns:w16="http://schemas.microsoft.com/office/word/2018/wordml" xmlns:w16du="http://schemas.microsoft.com/office/word/2023/wordml/word16du" xmlns:w16sdtdh="http://schemas.microsoft.com/office/word/2020/wordml/sdtdatahash" xmlns:w16sdtfl="http://schemas.microsoft.com/office/word/2024/wordml/sdtformatlock" xmlns:w16se="http://schemas.microsoft.com/office/word/2015/wordml/symex" xmlns:wpg="http://schemas.microsoft.com/office/word/2010/wordprocessingGroup" xmlns:wpi="http://schemas.microsoft.com/office/word/2010/wordprocessingInk" xmlns:wne="http://schemas.microsoft.com/office/word/2006/wordml" xmlns:wps="http://schemas.microsoft.com/office/word/2010/wordprocessingShape" mc:Ignorable="w14 w15 w16se w16cid w16 w16cex w16sdtdh w16sdtfl w16du wp14">
   <w:abstractNum w:abstractNumId="0" w15:restartNumberingAfterBreak="0">
     <w:nsid w:val="086F2826"/>
     <w:multiLevelType w:val="multilevel"/>

</xml_diff>